<commit_message>
Auditoria cientifica: benchmark naive baseline, moderacion epistemologica y variabilidad de metricas
</commit_message>
<xml_diff>
--- a/Propuesta_Argentiva_VS_Estados_Unidos/Paper/Paper_Comparativo_Argentina_USA_2026.docx
+++ b/Propuesta_Argentiva_VS_Estados_Unidos/Paper/Paper_Comparativo_Argentina_USA_2026.docx
@@ -111,7 +111,7 @@
           <w:i w:val="0"/>
           <w:sz w:val="19"/>
         </w:rPr>
-        <w:t>La diabetes mellitus tipo 2 representa una de las crisis sanitarias y socioeconómicas más apremiantes del siglo XXI, exhibiendo patrones de distribución territorial profundamente heterogéneos que desafían la capacidad analítica de la epidemiología computacional. Este trabajo desarrolla un pipeline reproducible de ciencia de datos en salud para contrastar empíricamente los determinantes territoriales de la enfermedad entre los 51 estados de los Estados Unidos (CDC BRFSS 2015, N=441.456 encuestados agregados con ponderación muestral) y las 24 jurisdicciones provinciales de la República Argentina (4ª Encuesta Nacional de Factores de Riesgo ENFR 2018 integrada con los Censos 2010/2022 y la Encuesta Permanente de Hogares del INDEC). Los resultados revelan una marcada divergencia estructural asociada a la arquitectura de los sistemas sanitarios: en los Estados Unidos, donde predomina un régimen fragmentado y de aseguramiento privado, la diabetes exhibe una correlación lineal consistente con el gradiente socioeconómico, donde los bajos ingresos (r = +0,81) y el sedentarismo (r = +0,79) concentran la morbimortalidad en el 'Cinturón de la Diabetes' del sur profundo, permitiendo modelos de regresión OLS con R² = 0,89 y Random Forest con R²_CV = 0,80. Por el contrario, en la Argentina la prevalencia provincial declarada no exhibe correlación con la pobreza monetaria (r = -0,05) ni con la falta de cobertura médica formal (r = -0,16). Esta discrepancia es analizada a la luz de dos mecanismos del sistema sanitario: en primer lugar, un severo sesgo de subdiagnóstico en provincias del norte (Chaco 10,3% de prevalencia con 39,7% de población jamás testeada), donde la carencia de screening preventivo invisibiliza la patología en encuestas autorreportadas; en segundo lugar, la función amortiguadora del subsistema público universal y programas estatales de provisión de fármacos (como el Programa Remediar), compatibles con el hecho de que distritos con más del 50% de población sin seguro médico formal alcancen coberturas terapéuticas superiores al 60% (Formosa 62,6%, Santa Cruz 70,0%). En el plano metodológico, se comprueba que los modelos de Machine Learning aplicados sobre agregaciones provinciales (N=24) experimentan un colapso predictivo fuera de muestra (LOOCV R² = -0,70; Random Forest R²_CV = -0,80), fundamentando la conveniencia de privilegiar atlas geoespaciales descriptivos y políticas focalizadas de pesquisa activa territorial frente al solucionismo predictivo.</w:t>
+        <w:t>La diabetes mellitus tipo 2 representa una de las crisis sanitarias y socioeconómicas más apremiantes del siglo XXI, exhibiendo patrones de distribución territorial profundamente heterogéneos que desafían la capacidad analítica de la epidemiología computacional. Este trabajo desarrolla un pipeline reproducible de ciencia de datos en salud para contrastar empíricamente los determinantes territoriales de la enfermedad entre los 51 estados de los Estados Unidos (CDC BRFSS 2015, N=441.456 encuestados agregados con ponderación muestral) y las 24 jurisdicciones provinciales de la República Argentina (4ª Encuesta Nacional de Factores de Riesgo ENFR 2018 integrada con los Censos 2010/2022 y la Encuesta Permanente de Hogares del INDEC). Los resultados revelan una marcada divergencia estructural asociada a la arquitectura de los sistemas sanitarios: en los Estados Unidos, donde predomina un régimen fragmentado y de aseguramiento privado, la diabetes exhibe una correlación lineal consistente con el gradiente socioeconómico, donde los bajos ingresos (r = +0,81) y el sedentarismo (r = +0,79) concentran la morbimortalidad en el 'Cinturón de la Diabetes' del sur profundo, permitiendo modelos de regresión OLS con R² = 0,89 y Random Forest con R²_CV = 0,80. Por el contrario, en la Argentina la prevalencia provincial declarada no exhibe correlación con la pobreza monetaria (r = -0,05) ni con la falta de cobertura médica formal (r = -0,16). Esta discrepancia es analizada a la luz de dos mecanismos del sistema sanitario: en primer lugar, un severo sesgo de subdiagnóstico en provincias del norte (Chaco 10,3% de prevalencia con 39,7% de población jamás testeada), donde la carencia de screening preventivo invisibiliza la patología en encuestas autorreportadas; en segundo lugar, la función amortiguadora del subsistema público universal y programas estatales de provisión de fármacos (como el Programa Remediar), compatibles con el hecho de que distritos con más del 50% de población sin seguro médico formal alcancen coberturas terapéuticas superiores al 60% (Formosa 62,6%, Santa Cruz 70,0%). En el plano metodológico, se observa que los modelos supervisados de Machine Learning aplicados sobre agregaciones provinciales (N=24) experimentan una marcada pérdida de capacidad predictiva fuera de muestra frente al estimador baseline (LOOCV R² = -0,70; Random Forest R²_CV = -0,80), fundamentando la conveniencia de privilegiar atlas geoespaciales descriptivos y políticas focalizadas de pesquisa activa territorial frente al solucionismo predictivo.</w:t>
       </w:r>
     </w:p>
     <w:p>
@@ -167,7 +167,7 @@
           <w:i w:val="0"/>
           <w:sz w:val="19"/>
         </w:rPr>
-        <w:t>Type 2 diabetes mellitus represents one of the most pressing public health and socioeconomic crises of the 21st century, exhibiting profoundly heterogeneous territorial distribution patterns that challenge computational epidemiology. This paper presents a reproducible health data science pipeline that empirically contrasts the territorial determinants of the disease between the 51 United States jurisdictions (CDC BRFSS 2015, N=441,456 individual microdata aggregated via sampling weights) and the 24 provinces of Argentina (4th National Risk Factor Survey ENFR 2018 integrated with the 2010/2022 National Censuses and the Permanent Household Survey EPH from INDEC). The findings demonstrate sharp structural divergences rooted in healthcare system design: in the United States, dominated by private market-driven healthcare, diabetes prevalence follows a marked linear gradient governed by socioeconomic deprivation, where low household income (r = +0.81) and physical inactivity (r = +0.79) heavily concentrate disease burden in the Southern 'Diabetes Belt', enabling multivariate OLS models to achieve R² = 0.89 and Random Forest algorithms to reach R²_CV = 0.80. In sharp contrast, in Argentina provincial self-reported prevalence exhibits no positive correlation with monetary poverty (r = -0.05) nor with the lack of formal health insurance (r = -0.16). This disconnect is analyzed under two structural healthcare dynamics: first, severe underdiagnosis in northern provinces (Chaco 10.3% prevalence with 39.7% of adults never tested), where the absence of clinical screening masks disease in self-reported surveys; second, the buffering role of universal public healthcare and essential drug programs (Remediar), consistent with vulnerable provinces with over 50% uninsured individuals reaching pharmacological treatment rates above 60%. Methodologically, we demonstrate that machine learning algorithms on small-sample provincial administrative aggregations (N=24) suffer from predictive collapse out-of-sample (LOOCV R² = -0.70; Random Forest R²_CV = -0.80), supporting the priority of descriptive geospatial atlases and targeted proactive screening over fragile predictive claims.</w:t>
+        <w:t>Type 2 diabetes mellitus represents one of the most pressing public health and socioeconomic crises of the 21st century, exhibiting profoundly heterogeneous territorial distribution patterns that challenge computational epidemiology. This paper presents a reproducible health data science pipeline that empirically contrasts the territorial determinants of the disease between the 51 United States jurisdictions (CDC BRFSS 2015, N=441,456 individual microdata aggregated via sampling weights) and the 24 provinces of Argentina (4th National Risk Factor Survey ENFR 2018 integrated with the 2010/2022 National Censuses and the Permanent Household Survey EPH from INDEC). The findings demonstrate sharp structural divergences rooted in healthcare system design: in the United States, dominated by private market-driven healthcare, diabetes prevalence follows a marked linear gradient governed by socioeconomic deprivation, where low household income (r = +0.81) and physical inactivity (r = +0.79) heavily concentrate disease burden in the Southern 'Diabetes Belt', enabling multivariate OLS models to achieve R² = 0.89 and Random Forest algorithms to reach R²_CV = 0.80. In sharp contrast, in Argentina provincial self-reported prevalence exhibits no positive correlation with monetary poverty (r = -0.05) nor with the lack of formal health insurance (r = -0.16). This disconnect is analyzed under two structural healthcare dynamics: first, severe underdiagnosis in northern provinces (Chaco 10.3% prevalence with 39.7% of adults never tested), where the absence of clinical screening masks disease in self-reported surveys; second, the buffering role of universal public healthcare and essential drug programs (Remediar), consistent with vulnerable provinces with over 50% uninsured individuals reaching pharmacological treatment rates above 60%. Methodologically, we observe that supervised machine learning algorithms applied to provincial-level administrative aggregations (N=24) suffer a marked degradation in out-of-sample predictive performance relative to the naive baseline estimator (LOOCV R² = -0.70; Random Forest R²_CV = -0.80), highlighting the critical value of descriptive geospatial atlases and proactive clinical screening over fragile predictive formulations.</w:t>
       </w:r>
     </w:p>
     <w:p>
@@ -2572,7 +2572,7 @@
           <w:i w:val="0"/>
           <w:sz w:val="20"/>
         </w:rPr>
-        <w:t>1. La barrera de prevención y el sesgo de subdiagnóstico: Al tratarse de una patología frecuentemente asintomática en estadios iniciales, la identificación clínica depende del acceso a análisis de laboratorio en ayunas. En la Argentina, la cobertura de screening exhibe una marcada disparidad territorial (Figura 5b): existe una correlación lineal negativa de gran magnitud entre la pobreza estructural (NBI) y la realización de controles de glucemia (r = -0,74; p &lt; 0,001). Mientras en CABA y Santa Fe más del 89-92% de los adultos se ha testeado, en provincias del NEA y NOA (Chaco 60,3%, Formosa 61,1%, Santiago del Estero 60,6%) aproximadamente cuatro de cada diez adultos refieren no haberse realizado jamás un control glucémico en su vida [3]. Dado que las encuestas poblacionales computan casos conocidos por autorreporte, la falta de diagnóstico oportuno en las regiones más vulnerables tiende a deprimir artificialmente las tasas de prevalencia declarada.</w:t>
+        <w:t>1. La barrera de prevención y la hipótesis del subdiagnóstico: Al tratarse de una patología frecuentemente asintomática en sus estadios iniciales, la identificación clínica depende del acceso efectivo a análisis bioquímicos de laboratorio en ayunas. En la Argentina, la cobertura de screening exhibe una marcada disparidad territorial (Figura 5b): se constata una correlación lineal negativa de gran magnitud a nivel macroecológico entre la pobreza estructural (NBI) y la realización de controles de glucemia alguna vez en la vida (r = -0,74; p &lt; 0,001). Mientras en CABA y Santa Fe más del 89-92% de los adultos refiere haberse testeado, en provincias del NEA y NOA (Chaco 60,3%, Formosa 61,1%, Santiago del Estero 60,6%) aproximadamente cuatro de cada diez adultos refieren no haberse realizado jamás un control glucémico en su vida [3]. Dado que las encuestas poblacionales computan casos conocidos por autorreporte, esta brecha de pesquisa sustenta la hipótesis explicativa del subdiagnóstico: la menor detección en jurisdicciones vulnerables tiende a atenuar artificialmente la prevalencia declarada, impidiendo que emerja el gradiente socioeconómico positivo. Conviene subrayar que este indicador ecológico opera como un estimador proxy del acceso diferencial al sistema sanitario y no como una prueba causal directa ni una cuantificación unívoca del subreporte, cuya estimación numérica rigurosa requerirá la contrastación con las submuestras bioquímicas de laboratorio de la ENFR (Cuadros 7.9–7.11).</w:t>
       </w:r>
     </w:p>
     <w:p>
@@ -2604,7 +2604,7 @@
           <w:i w:val="0"/>
           <w:sz w:val="20"/>
         </w:rPr>
-        <w:t>En los Estados Unidos rige la dinámica inversa (Figura 4b): la pesquisa clínica preventiva es rutinaria y masiva (&gt;85%), pero el aseguramiento fragmentado impone barreras de copago y precio farmacológico (donde estudios de la ADA y la literatura especializada reportan costos mensuales que han superado históricamente los USD 300 por mes por paciente, propiciando el racionamiento involuntario de medicación [5], [26]).</w:t>
+        <w:t>En los Estados Unidos rige la dinámica inversa (Figura 4b): la pesquisa clínica preventiva rutinaria alcanza coberturas muy elevadas (&gt;85% según microdatos del CDC BRFSS [6], [13]), pero el aseguramiento fragmentado impone barreras de copago y precio farmacológico (donde estudios de la ADA y la literatura especializada reportan costos mensuales que han superado históricamente los USD 300 por mes por paciente, propiciando el racionamiento involuntario de medicación [5], [26]).</w:t>
       </w:r>
     </w:p>
     <w:p>
@@ -2686,7 +2686,7 @@
           <w:i w:val="0"/>
           <w:sz w:val="18"/>
         </w:rPr>
-        <w:t>Tabla 3. Diagnóstico comparativo de rendimiento in-sample y generalización fuera de muestra (Validation Cross-Validation y LOOCV).</w:t>
+        <w:t>Tabla 3. Diagnóstico comparativo de rendimiento in-sample y generalización fuera de muestra (Validation Cross-Validation y LOOCV) frente al estimador naive baseline.</w:t>
       </w:r>
     </w:p>
     <w:tbl>
@@ -2850,7 +2850,7 @@
                 <w:i w:val="0"/>
                 <w:sz w:val="17"/>
               </w:rPr>
-              <w:t>OLS Multivariado (Muestra completa)</w:t>
+              <w:t>Estimador Naive Baseline (Media constante ȳ)</w:t>
             </w:r>
           </w:p>
         </w:tc>
@@ -2870,7 +2870,7 @@
                 <w:i w:val="0"/>
                 <w:sz w:val="17"/>
               </w:rPr>
-              <w:t>0.891 (0.878)</w:t>
+              <w:t>0.000</w:t>
             </w:r>
           </w:p>
         </w:tc>
@@ -2890,7 +2890,7 @@
                 <w:i w:val="0"/>
                 <w:sz w:val="17"/>
               </w:rPr>
-              <w:t>0.50%</w:t>
+              <w:t>1.53%</w:t>
             </w:r>
           </w:p>
         </w:tc>
@@ -2910,7 +2910,7 @@
                 <w:i w:val="0"/>
                 <w:sz w:val="17"/>
               </w:rPr>
-              <w:t>0.264 (0.059)</w:t>
+              <w:t>0.000</w:t>
             </w:r>
           </w:p>
         </w:tc>
@@ -2930,7 +2930,7 @@
                 <w:i w:val="0"/>
                 <w:sz w:val="17"/>
               </w:rPr>
-              <w:t>1.44%</w:t>
+              <w:t>1.59%</w:t>
             </w:r>
           </w:p>
         </w:tc>
@@ -2950,7 +2950,7 @@
                 <w:i w:val="0"/>
                 <w:sz w:val="17"/>
               </w:rPr>
-              <w:t>EE.UU. altamente significativo (p&lt;0.001); Argentina no significativo (p=0.16)</w:t>
+              <w:t>Referencia base (R²=0): dispersión intrínseca sin covariables (Var=4,24)</w:t>
             </w:r>
           </w:p>
         </w:tc>
@@ -2972,7 +2972,7 @@
                 <w:i w:val="0"/>
                 <w:sz w:val="17"/>
               </w:rPr>
-              <w:t>Validación Cruzada OLS (LOOCV en Arg, 5-Fold en US)</w:t>
+              <w:t>OLS Multivariado (Muestra completa)</w:t>
             </w:r>
           </w:p>
         </w:tc>
@@ -2992,7 +2992,7 @@
                 <w:i w:val="0"/>
                 <w:sz w:val="17"/>
               </w:rPr>
-              <w:t>0.842</w:t>
+              <w:t>0.891 (0.878)</w:t>
             </w:r>
           </w:p>
         </w:tc>
@@ -3012,7 +3012,7 @@
                 <w:i w:val="0"/>
                 <w:sz w:val="17"/>
               </w:rPr>
-              <w:t>0.59%</w:t>
+              <w:t>0.50%</w:t>
             </w:r>
           </w:p>
         </w:tc>
@@ -3032,7 +3032,7 @@
                 <w:i w:val="0"/>
                 <w:sz w:val="17"/>
               </w:rPr>
-              <w:t>-0.701</w:t>
+              <w:t>0.264 (0.059)</w:t>
             </w:r>
           </w:p>
         </w:tc>
@@ -3052,7 +3052,7 @@
                 <w:i w:val="0"/>
                 <w:sz w:val="17"/>
               </w:rPr>
-              <w:t>2.12%</w:t>
+              <w:t>1.44%</w:t>
             </w:r>
           </w:p>
         </w:tc>
@@ -3072,7 +3072,7 @@
                 <w:i w:val="0"/>
                 <w:sz w:val="17"/>
               </w:rPr>
-              <w:t>Colapso predictivo en Argentina (R² negativo): sobreajuste por N=24 reducido</w:t>
+              <w:t>EE.UU. altamente significativo (p&lt;0.001); Argentina no significativo (p=0.31)</w:t>
             </w:r>
           </w:p>
         </w:tc>
@@ -3094,6 +3094,128 @@
                 <w:i w:val="0"/>
                 <w:sz w:val="17"/>
               </w:rPr>
+              <w:t>Validación Cruzada OLS (LOOCV en Arg, 5-Fold en US)</w:t>
+            </w:r>
+          </w:p>
+        </w:tc>
+        <w:tc>
+          <w:tcPr>
+            <w:tcW w:type="dxa" w:w="1606"/>
+          </w:tcPr>
+          <w:p>
+            <w:pPr>
+              <w:spacing w:after="30" w:before="30"/>
+              <w:jc w:val="center"/>
+            </w:pPr>
+            <w:r>
+              <w:rPr>
+                <w:rFonts w:ascii="Times New Roman" w:hAnsi="Times New Roman" w:eastAsia="Times New Roman"/>
+                <w:b w:val="0"/>
+                <w:i w:val="0"/>
+                <w:sz w:val="17"/>
+              </w:rPr>
+              <w:t>0.842</w:t>
+            </w:r>
+          </w:p>
+        </w:tc>
+        <w:tc>
+          <w:tcPr>
+            <w:tcW w:type="dxa" w:w="1606"/>
+          </w:tcPr>
+          <w:p>
+            <w:pPr>
+              <w:spacing w:after="30" w:before="30"/>
+              <w:jc w:val="center"/>
+            </w:pPr>
+            <w:r>
+              <w:rPr>
+                <w:rFonts w:ascii="Times New Roman" w:hAnsi="Times New Roman" w:eastAsia="Times New Roman"/>
+                <w:b w:val="0"/>
+                <w:i w:val="0"/>
+                <w:sz w:val="17"/>
+              </w:rPr>
+              <w:t>0.59%</w:t>
+            </w:r>
+          </w:p>
+        </w:tc>
+        <w:tc>
+          <w:tcPr>
+            <w:tcW w:type="dxa" w:w="1606"/>
+          </w:tcPr>
+          <w:p>
+            <w:pPr>
+              <w:spacing w:after="30" w:before="30"/>
+              <w:jc w:val="center"/>
+            </w:pPr>
+            <w:r>
+              <w:rPr>
+                <w:rFonts w:ascii="Times New Roman" w:hAnsi="Times New Roman" w:eastAsia="Times New Roman"/>
+                <w:b w:val="0"/>
+                <w:i w:val="0"/>
+                <w:sz w:val="17"/>
+              </w:rPr>
+              <w:t>-0.701</w:t>
+            </w:r>
+          </w:p>
+        </w:tc>
+        <w:tc>
+          <w:tcPr>
+            <w:tcW w:type="dxa" w:w="1606"/>
+          </w:tcPr>
+          <w:p>
+            <w:pPr>
+              <w:spacing w:after="30" w:before="30"/>
+              <w:jc w:val="center"/>
+            </w:pPr>
+            <w:r>
+              <w:rPr>
+                <w:rFonts w:ascii="Times New Roman" w:hAnsi="Times New Roman" w:eastAsia="Times New Roman"/>
+                <w:b w:val="0"/>
+                <w:i w:val="0"/>
+                <w:sz w:val="17"/>
+              </w:rPr>
+              <w:t>2.12%</w:t>
+            </w:r>
+          </w:p>
+        </w:tc>
+        <w:tc>
+          <w:tcPr>
+            <w:tcW w:type="dxa" w:w="1606"/>
+          </w:tcPr>
+          <w:p>
+            <w:pPr>
+              <w:spacing w:after="30" w:before="30"/>
+              <w:jc w:val="center"/>
+            </w:pPr>
+            <w:r>
+              <w:rPr>
+                <w:rFonts w:ascii="Times New Roman" w:hAnsi="Times New Roman" w:eastAsia="Times New Roman"/>
+                <w:b w:val="0"/>
+                <w:i w:val="0"/>
+                <w:sz w:val="17"/>
+              </w:rPr>
+              <w:t>Marcada degradación predictiva en Arg (R² &lt; 0): el error supera al estimador baseline</w:t>
+            </w:r>
+          </w:p>
+        </w:tc>
+      </w:tr>
+      <w:tr>
+        <w:tc>
+          <w:tcPr>
+            <w:tcW w:type="dxa" w:w="1606"/>
+          </w:tcPr>
+          <w:p>
+            <w:pPr>
+              <w:spacing w:after="30" w:before="30"/>
+              <w:jc w:val="left"/>
+            </w:pPr>
+            <w:r>
+              <w:rPr>
+                <w:rFonts w:ascii="Times New Roman" w:hAnsi="Times New Roman" w:eastAsia="Times New Roman"/>
+                <w:b w:val="0"/>
+                <w:i w:val="0"/>
+                <w:sz w:val="17"/>
+              </w:rPr>
               <w:t>Random Forest Regressor (5-Fold CV)</w:t>
             </w:r>
           </w:p>
@@ -3194,7 +3316,7 @@
                 <w:i w:val="0"/>
                 <w:sz w:val="17"/>
               </w:rPr>
-              <w:t>Random Forest generaliza con alta precisión en EE.UU.; falla en Arg por falta de N</w:t>
+              <w:t>Sólido ajuste en EE.UU.; en Arg falla por distorsión de subdiagnóstico y reducido N=24</w:t>
             </w:r>
           </w:p>
         </w:tc>
@@ -4206,7 +4328,7 @@
           <w:i w:val="0"/>
           <w:sz w:val="20"/>
         </w:rPr>
-        <w:t>El contraste entre algoritmos lineales y no lineales (Tabla 3) aporta una advertencia fundamental para la ciencia de datos en salud. En los Estados Unidos (N=51), tanto la regresión lineal múltiple OLS (R² = 0,891, R²_adj = 0,878) como el ensamble no lineal de Random Forest (R²_CV = 0,802 bajo 5-fold CV) exhiben una alta capacidad de ajuste y generalización, con errores medios absolutos inferiores al 0,7%.</w:t>
+        <w:t>El contraste entre algoritmos lineales y no lineales frente a un modelo de referencia ingenuo o naive baseline (Tabla 3) aporta una demostración cuantitativa rigurosa sobre los límites del modelado predictivo en epidemiología espacial. En los Estados Unidos (N=51), el gradiente socioeconómico homogéneo permite que tanto la regresión lineal múltiple OLS (R² = 0,891, R²_adj = 0,878) como el ensamble no lineal de Random Forest (R²_CV = 0,802) alcancen un sólido desempeño fuera de muestra, reduciendo drásticamente el error absoluto medio desde el valor base de 1,53% a 0,50% in-sample y 0,59% en validación cruzada 5-fold. La variabilidad inter-fold en EE.UU. resulta sumamente reducida (MAE = 0,59% ± 0,04%; R² = 0,77 ± 0,10), certificando la estabilidad estructural de la señal predictiva a lo largo de las divisiones geográficas norteamericanas.</w:t>
       </w:r>
     </w:p>
     <w:p>
@@ -4222,7 +4344,7 @@
           <w:i w:val="0"/>
           <w:sz w:val="20"/>
         </w:rPr>
-        <w:t>Por el contrario, al replicar la modelización sobre las 24 provincias argentinas, se comprueba un colapso en la capacidad predictiva fuera de muestra: si bien el modelo OLS in-sample presenta un R² de 0,264 (R²_adj = 0,059), al evaluarlo mediante validación cruzada Leave-One-Out (LOOCV) el coeficiente se desploma a R²_LOOCV = -0,701 (MAE = 2,12%). Asimismo, Random Forest genera un R²_CV marcadamente negativo (-0,802; MAE = 2,20%).</w:t>
+        <w:t>Por el contrario, al replicar la modelización sobre las 24 provincias argentinas, se evidencia por qué el modelado predictivo fracasa fuera de muestra frente al estimador de referencia. Un predictor ingenuo que asigne sistemáticamente la media constante provincial (ȳ = 13,0%) obtiene, por definición, R² = 0, con una desviación absoluta media de MAE_baseline = 1,59% y una varianza no explicada de MSE_baseline = Var(y) = 4,24. Si bien el modelo OLS in-sample aparenta un ajuste modesto (R² = 0,264, R²_adj = 0,059, MAE = 1,44%), al someterlo a validación cruzada exhaustiva Leave-One-Out (LOOCV, determinística sobre los 24 pliegues jurisdiccionales), el error absoluto medio asciende a MAE = 2,12% y el error cuadrático medio escala a MSE_LOOCV = 7,21. Dado que la métrica formal de evaluación fuera de muestra es R²_CV = 1 - (MSE_modelo / MSE_baseline), y el error cuadrático del modelo supera a la varianza de los datos en un 70,1% (7,21 / 4,24 = 1,701), el coeficiente resultante se torna estrictamente negativo (R²_LOOCV = -0,701). Idéntica degradación exhibe el ensamble no lineal de Random Forest (R²_CV = -0,802; MAE = 2,20%).</w:t>
       </w:r>
     </w:p>
     <w:p>
@@ -4238,7 +4360,7 @@
           <w:i w:val="0"/>
           <w:sz w:val="20"/>
         </w:rPr>
-        <w:t>Desde el punto de vista estadístico, un R² negativo en validación cruzada indica formalmente que el error cuadrático medio de las predicciones fuera de muestra supera a la varianza de la variable objetivo; es decir, el modelo rinde peor que un predictor ingenuo que asigne sistemáticamente la media constante ȳ. Es crucial notar que este fenómeno no se debe exclusivamente a que N=24 sea una muestra acotada: en EE.UU. la muestra territorial agregada también es reducida (N=51). La disparidad sustantiva radica en que en los Estados Unidos existe un gradiente socioeconómico lineal muy robusto y homogéneo que el algoritmo logra captar con facilidad, mientras que en la Argentina la presencia de subdiagnóstico territorial y las respuestas asimétricas del sistema sanitario distorsionan la linealidad de la prevalencia observada. En tales condiciones, forzar algoritmos supervisados de Machine Learning sobre datos agregados reducidos induce a un sobreajuste severo. Por ende, la práctica rigurosa en ciencia de datos de salud en contextos heterogéneos consiste en priorizar atlas descriptivos, diagnósticos de calidad de dato y pesquisas activas.</w:t>
+        <w:t>Esta demostración formal prueba que en la Argentina la inclusión de covariables socioeconómicas convencionales a escala agregada no agrega potencia predictiva fuera de muestra, sino que introduce varianza espuria y sobreajuste que degradan el pronóstico respecto a la simple media histórica provincial. Tal fenómeno no es atribuible únicamente a la muestra acotada (N=24), dado que en EE.UU. la agregación interestatal también opera con un tamaño reducido (N=51). La causa sustantiva radica en el desacople estructural producido por el subdiagnóstico territorial: al no medirse la verdadera prevalencia biológica en las provincias de mayor vulnerabilidad sino solo los casos autorreportados, la señal predictiva lineal queda distorsionada. En tales condiciones, forzar algoritmos supervisados de Machine Learning sobre datos agregados reducidos induce a sobreajustes severos. Por ende, la recomendación metodológica concluyente consiste en priorizar atlas geoespaciales descriptivos, auditorías de calidad de dato y operativos proactivos de pesquisa clínica territorial por sobre el solucionismo predictivo algorítmico.</w:t>
       </w:r>
     </w:p>
     <w:p>
@@ -4350,7 +4472,7 @@
           <w:i w:val="0"/>
           <w:sz w:val="20"/>
         </w:rPr>
-        <w:t>Asimismo, deben reconocerse las limitaciones inherentes al estudio: el desfasaje temporal entre relevamientos (BRFSS 2015, ENFR 2018 y Censos 2010/2022), las divergencias metodológicas entre encuestas telefónicas y presenciales de hogares, y el riesgo de incurrir en falacia ecológica si se intentan trasladar estas relaciones interprovinciales a conductas o riesgos individuales.</w:t>
+        <w:t>Asimismo, debe subrayarse con cautela metodológica la distinción entre lo observado empíricamente y las hipótesis formuladas: la fuerte correlación inversa entre pobreza estructural y controles de glucemia (r = -0,74) aporta una evidencia empírica consistente a favor de la hipótesis del subdiagnóstico territorial en el norte argentino, pero opera como un indicador proxy ecológico y no constituye una prueba causal estricta ni permite fijar a priori un porcentaje exacto de casos ocultos. De igual modo, deben reconocerse las limitaciones inherentes al estudio: el desfasaje temporal entre relevamientos (BRFSS 2015, ENFR 2018 y Censos 2010/2022), las divergencias de modalidad entre encuestas telefónicas (CATI) y presenciales de hogares, y el riesgo de incurrir en falacia ecológica si se intentan trasladar estas relaciones macrojurisdiccionales a conductas o riesgos biológicos individuales.</w:t>
       </w:r>
     </w:p>
     <w:p>
@@ -4382,7 +4504,7 @@
           <w:i w:val="0"/>
           <w:sz w:val="20"/>
         </w:rPr>
-        <w:t>Se implementó un pipeline reproducible de ciencia de datos que comparó los determinantes territoriales de la diabetes mellitus entre los Estados Unidos y la República Argentina. Los hallazgos sugieren que mientras en EE.UU. la privación socioeconómica exhibe una fuerte correlación lineal con la prevalencia observada (r = +0,81; R² = 0,891), en la Argentina el sesgo de subdiagnóstico en regiones con alta pobreza estructural (r = -0,74 entre NBI y screening) desacopla la prevalencia declarada, mientras que el subsistema público amortigua la brecha farmacológica entre diagnosticados.</w:t>
+        <w:t>Se implementó un pipeline reproducible de ciencia de datos que comparó los determinantes territoriales de la diabetes mellitus entre los Estados Unidos y la República Argentina. Los hallazgos sugieren que mientras en EE.UU. la privación socioeconómica exhibe una fuerte correlación lineal con la prevalencia observada (r = +0,81; R² = 0,891), en la Argentina la menor cobertura de screening en regiones con alta pobreza estructural (r = -0,74 entre NBI y tamizaje) sustenta la hipótesis de subdiagnóstico como factor de distorsión de la prevalencia declarada, mientras que el subsistema público amortigua la brecha farmacológica entre los diagnosticados.</w:t>
       </w:r>
     </w:p>
     <w:p>
@@ -4398,7 +4520,7 @@
           <w:i w:val="0"/>
           <w:sz w:val="20"/>
         </w:rPr>
-        <w:t>Asimismo, se comprobó que los modelos supervisados de Machine Learning aplicados a nivel provincial (N=24) carecen de capacidad de generalización fuera de muestra (LOOCV R² = -0,701; Random Forest R² = -0,802), fundamentando el valor del atlas geoespacial y el análisis descriptivo riguroso como enfoques prioritarios en salud pública.</w:t>
+        <w:t>Asimismo, se demostró cuantitativamente que los modelos supervisados de Machine Learning aplicados a nivel provincial (N=24) experimentan una sustancial pérdida de capacidad predictiva fuera de muestra frente al estimador baseline ingenuo (LOOCV R² = -0,701; Random Forest R² = -0,802; MAE = 2,12% vs. baseline 1,59%), fundamentando el valor del atlas geoespacial y el análisis descriptivo riguroso como enfoques prioritarios en salud pública.</w:t>
       </w:r>
     </w:p>
     <w:p>
@@ -4414,7 +4536,7 @@
           <w:i w:val="0"/>
           <w:sz w:val="20"/>
         </w:rPr>
-        <w:t>Como líneas futuras se proyecta: (i) procesar los microdatos individuales de la ENFR para calibrar modelos multinivel jerárquicos persona-jurisdicción; (ii) incorporar las submuestras bioquímicas de laboratorio (Cuadros 7.9–7.11) para estimar formalmente el factor de subdiagnóstico; y (iii) monitorear la evolución del atlas ante nuevas publicaciones de estadísticas sanitarias y censales.</w:t>
+        <w:t>Como líneas futuras se proyecta: (i) procesar los microdatos individuales de la ENFR para calibrar modelos multinivel jerárquicos persona-jurisdicción; (ii) incorporar las submuestras bioquímicas de laboratorio de la ENFR (Cuadros 7.9–7.11) para cuantificar formalmente la discrepancia entre diabetes autorreportada y glucemia alterada de laboratorio; y (iii) monitorear la evolución del atlas ante nuevas publicaciones de estadísticas sanitarias y censales.</w:t>
       </w:r>
     </w:p>
     <w:p>

</xml_diff>

<commit_message>
Refinamiento final: homogenizacion estricta de prevalencia autorreportada y certificacion anti-data-leakage
</commit_message>
<xml_diff>
--- a/Propuesta_Argentiva_VS_Estados_Unidos/Paper/Paper_Comparativo_Argentina_USA_2026.docx
+++ b/Propuesta_Argentiva_VS_Estados_Unidos/Paper/Paper_Comparativo_Argentina_USA_2026.docx
@@ -492,7 +492,7 @@
           <w:i w:val="0"/>
           <w:sz w:val="20"/>
         </w:rPr>
-        <w:t>1. 4ª Encuesta Nacional de Factores de Riesgo (ENFR 2018): De sus cuadros definitivos se extrajeron la prevalencia de diabetes o glucemia elevada por autorreporte o medición (Cuadro 7.3) junto con su coeficiente de variación muestral (CV, todos inferiores al 12,5%, certificando confiabilidad); el porcentaje de personas con diabetes bajo tratamiento farmacológico activo con pastillas o insulina (Cuadro 7.5); la tasa de screening preventivo de glucemia alguna vez en la vida (Cuadro 7.1); obesidad autorreportada IMC≥30 (Cuadro 6.3); sedentarismo (Cuadro 3.1); hipertensión arterial autorreportada (Cuadro 8.3); y consumo de frutas/verduras (Cuadro 5.7).</w:t>
+        <w:t>1. 4ª Encuesta Nacional de Factores de Riesgo (ENFR 2018): De sus cuadros definitivos se extrajeron la prevalencia de diabetes o glucemia elevada por autorreporte (Cuadro 7.3, derivado de la pregunta estandarizada sobre diagnóstico previo brindado por personal de salud) junto con su coeficiente de variación muestral (CV, todos inferiores al 12,5%, certificando confiabilidad estadística oficial); el porcentaje de personas con diabetes bajo tratamiento farmacológico activo con pastillas o insulina (Cuadro 7.5); la tasa de screening preventivo de glucemia alguna vez en la vida (Cuadro 7.1); obesidad autorreportada IMC≥30 (Cuadro 6.3); sedentarismo o inactividad física en tiempo libre (Cuadro 3.1); hipertensión arterial autorreportada (Cuadro 8.3); y consumo de frutas/verduras (Cuadro 5.7).</w:t>
       </w:r>
     </w:p>
     <w:p>
@@ -572,7 +572,7 @@
           <w:i w:val="0"/>
           <w:sz w:val="20"/>
         </w:rPr>
-        <w:t>El pipeline analítico calculó matrices de correlación bivariada de Pearson (r). Para el modelado supervisado se estimaron regresiones múltiples por Mínimos Cuadrados Ordinarios (OLS) con errores estándar robustos a heterocedasticidad (HC3 de MacKinnon-White) y Factores de Inflación de Varianza (VIF). La capacidad predictiva real y la generalización fuera de muestra se evaluaron mediante validación cruzada K-Fold (k=5) para EE.UU. y validación cruzada Leave-One-Out (LOOCV) para la Argentina.</w:t>
+        <w:t>El pipeline analítico calculó matrices de correlación bivariada de Pearson (r). Para el modelado supervisado se estimaron regresiones múltiples por Mínimos Cuadrados Ordinarios (OLS) con errores estándar robustos a heterocedasticidad (HC3 de MacKinnon-White) y Factores de Inflación de Varianza (VIF). La capacidad predictiva real y la generalización fuera de muestra se evaluaron mediante esquemas de validación cruzada particionada: K-Fold (k=5, con barajado aleatorio y semilla fija random_state=42) para los 51 estados de EE.UU. y validación cruzada exhaustiva Leave-One-Out (LOOCV) para las 24 jurisdicciones argentinas. En ambos esquemas, los modelos se ajustaron exclusivamente sobre el conjunto de entrenamiento de cada partición y se evaluaron sobre el pliegue de prueba no observado, garantizando la total ausencia de filtración de información (data leakage). Asimismo, se incorporó un modelo de referencia ingenuo (dummy baseline) que predice la media del conjunto de entrenamiento dentro del mismo esquema particionado para contrastar formalmente la ganancia predictiva neta.</w:t>
       </w:r>
     </w:p>
     <w:p>
@@ -620,7 +620,7 @@
           <w:i w:val="0"/>
           <w:sz w:val="20"/>
         </w:rPr>
-        <w:t>Desde el punto de vista metodológico, se contemplan tres aspectos analíticos centrales: (i) Comparabilidad de constructos: en ambas encuestas, la diabetes se operacionaliza a través del autorreporte de diagnóstico médico previo (excluyendo diabetes gestacional), y el IMC y sedentarismo se derivan de preguntas estandarizadas equivalentes. Si bien el BRFSS es telefónico asistido (CATI) y la ENFR es presencial en hogares, las ponderaciones muestrales calibran ambas fuentes para representar a la población adulta no institucionalizada. (ii) Heterogeneidad temporal: aunque coexisten registros de diferentes años (2010 a 2022), las disparidades territoriales estructurales (como las brechas de desarrollo del norte argentino o el gradiente del sur estadounidense) exhiben una notable inercia histórica en el mediano plazo. (iii) Control de la falacia ecológica: las correlaciones y regresiones computadas operan a nivel macro territorial; en consecuencia, los hallazgos describen propiedades ecológicas de los sistemas de salud y sus contextos jurisdiccionales, y no deben extrapolarse como inferencias causales individuales.</w:t>
+        <w:t>Desde el punto de vista metodológico, se contemplan tres aspectos analíticos centrales: (i) Comparabilidad de constructos: en ambas encuestas, la diabetes se operacionaliza de manera idéntica a través del autorreporte de diagnóstico médico previo en la población adulta de 18 años y más (excluyendo diabetes gestacional), tal como lo consignan el Cuadro 7.3 de la ENFR 2018 y la variable DIABETE3 del CDC BRFSS. De igual modo, la obesidad y el sedentarismo se derivan de definiciones operativas estandarizadas de índice de masa corporal (≥30) y ausencia de actividad física en tiempo libre. Si bien el BRFSS es telefónico asistido (CATI) y la ENFR es presencial en hogares, las ponderaciones muestrales calibran ambas fuentes para representar fielmente a la población adulta no institucionalizada. (ii) Heterogeneidad temporal: aunque coexisten registros de diferentes años (2010 a 2022), las disparidades territoriales estructurales exhiben una notable inercia histórica en el mediano plazo. (iii) Control de la falacia ecológica: las correlaciones y regresiones computadas operan a nivel macro territorial; en consecuencia, los hallazgos describen propiedades ecológicas de los sistemas de salud y no deben extrapolarse como inferencias causales individuales.</w:t>
       </w:r>
     </w:p>
     <w:p>
@@ -4408,7 +4408,7 @@
           <w:i w:val="0"/>
           <w:sz w:val="20"/>
         </w:rPr>
-        <w:t>Los hallazgos de este estudio tienen implicancias de política sanitaria directas. Sugieren que las barreras que obstaculizan el control integral de la diabetes operan en puntos opuestos de la cadena asistencial: en los Estados Unidos la barrera preponderante es financiera y de mercado (costos directos y copagos), requiriendo medidas regulatorias de precios tope a la insulina y subsidios a insumos [26]; en la Argentina la barrera crítica es de orden logístico, geográfico y de pesquisa temprana.</w:t>
+        <w:t>Los hallazgos de este estudio sustentan hipótesis interpretativas directas para la gestión sanitaria. Sugieren que las barreras que obstaculizan el control integral de la diabetes operan en puntos opuestos de la cadena asistencial: en los Estados Unidos los datos son consistentes con una barrera preponderante de mercado y cobertura financiera (costos directos y copagos), requiriendo medidas regulatorias de precios tope a la insulina y subsidios a insumos [26]; en la Argentina los patrones observados indican que la barrera crítica es de orden logístico, geográfico y de pesquisa temprana.</w:t>
       </w:r>
     </w:p>
     <w:p>
@@ -4424,7 +4424,7 @@
           <w:i w:val="0"/>
           <w:sz w:val="20"/>
         </w:rPr>
-        <w:t>En el territorio argentino, los programas de distribución gratuita de medicamentos esenciales como Remediar (Ley 26.914) han constituido un soporte de equidad para pacientes diagnosticados [27]. Sin embargo, su efectividad potencial se ve restringida si cerca del 40% de los adultos en provincias del norte nunca acceden a la detección inicial. Es prioritario orientar las políticas públicas hacia operativos activos de tamizaje en centros de atención primaria barriales y parajes rurales, superando la detección pasiva en hospitales cabecera.</w:t>
+        <w:t>En el territorio argentino, los programas de distribución gratuita de medicamentos esenciales como Remediar (Ley 26.914) representan un factor explicativo plausible para comprender la elevada adherencia terapéutica observada en pacientes ya diagnosticados del subsistema público [27]. Sin embargo, la efectividad potencial de dicha cobertura farmacológica se ve limitada si aproximadamente cuatro de cada diez adultos en provincias del norte nunca acceden al tamizaje inicial. Por tanto, es prioritario orientar las políticas públicas hacia operativos activos de detección temprana en centros de atención primaria barriales y parajes rurales, superando la detección pasiva hospitalaria.</w:t>
       </w:r>
     </w:p>
     <w:p>
@@ -4472,7 +4472,7 @@
           <w:i w:val="0"/>
           <w:sz w:val="20"/>
         </w:rPr>
-        <w:t>Asimismo, debe subrayarse con cautela metodológica la distinción entre lo observado empíricamente y las hipótesis formuladas: la fuerte correlación inversa entre pobreza estructural y controles de glucemia (r = -0,74) aporta una evidencia empírica consistente a favor de la hipótesis del subdiagnóstico territorial en el norte argentino, pero opera como un indicador proxy ecológico y no constituye una prueba causal estricta ni permite fijar a priori un porcentaje exacto de casos ocultos. De igual modo, deben reconocerse las limitaciones inherentes al estudio: el desfasaje temporal entre relevamientos (BRFSS 2015, ENFR 2018 y Censos 2010/2022), las divergencias de modalidad entre encuestas telefónicas (CATI) y presenciales de hogares, y el riesgo de incurrir en falacia ecológica si se intentan trasladar estas relaciones macrojurisdiccionales a conductas o riesgos biológicos individuales.</w:t>
+        <w:t>Asimismo, debe subrayarse con cautela metodológica la distinción entre lo observado empíricamente y las hipótesis interpretativas formuladas: la fuerte correlación inversa entre pobreza estructural y controles de glucemia (r = -0,74) aporta una evidencia empírica consistente que respalda la hipótesis del subdiagnóstico territorial en el norte argentino, pero opera como un indicador proxy ecológico y no constituye una prueba causal estricta ni una cuantificación cerrada de casos no detectados. Del mismo modo, la asociación entre vulnerabilidad social y sostenimiento del tratamiento farmacológico se plantea como una hipótesis compatible con la función amortiguadora del subsistema público, la cual deberá ser contrastada con registros individualizados de dispensación clínica. Finalmente, deben reconocerse las limitaciones inherentes al estudio: el desfasaje temporal entre relevamientos (BRFSS 2015, ENFR 2018 y Censos 2010/2022), las divergencias de modalidad entre encuestas telefónicas (CATI) y presenciales de hogares, y el riesgo de incurrir en falacia ecológica si se intentan trasladar estas relaciones macrojurisdiccionales a conductas o riesgos biológicos individuales.</w:t>
       </w:r>
     </w:p>
     <w:p>

</xml_diff>

<commit_message>
cmbios en referencias y nros
</commit_message>
<xml_diff>
--- a/Propuesta_Argentiva_VS_Estados_Unidos/Paper/Paper_Comparativo_Argentina_USA_2026.docx
+++ b/Propuesta_Argentiva_VS_Estados_Unidos/Paper/Paper_Comparativo_Argentina_USA_2026.docx
@@ -14,7 +14,7 @@
           <w:i w:val="0"/>
           <w:sz w:val="27"/>
         </w:rPr>
-        <w:t>Determinantes geoespaciales de la diabetes tipo 2 en la Argentina y los Estados Unidos: Salud basada en datos, brecha de tratamiento y límites del modelado predictivo</w:t>
+        <w:t>Determinantes geoespaciales de la diabetes tipo 2 en la Argentina y los Estados Unidos: Salud basada en datos, cobertura de tratamiento y límites del modelado predictivo</w:t>
       </w:r>
     </w:p>
     <w:p>
@@ -29,7 +29,7 @@
           <w:i/>
           <w:sz w:val="21"/>
         </w:rPr>
-        <w:t>Geospatial Determinants of Type 2 Diabetes in Argentina and the United States: Health Data Science, Treatment Gaps, and Boundaries of Predictive Modeling</w:t>
+        <w:t>Geospatial Determinants of Type 2 Diabetes in Argentina and the United States: Health Data Science, Treatment Coverage, and Boundaries of Predictive Modeling</w:t>
       </w:r>
     </w:p>
     <w:p>
@@ -111,7 +111,7 @@
           <w:i w:val="0"/>
           <w:sz w:val="19"/>
         </w:rPr>
-        <w:t>La diabetes mellitus tipo 2 representa una de las crisis sanitarias y socioeconómicas más apremiantes del siglo XXI, exhibiendo patrones de distribución territorial profundamente heterogéneos que desafían la capacidad analítica de la epidemiología computacional. Este trabajo desarrolla un pipeline reproducible de ciencia de datos en salud para contrastar empíricamente los determinantes territoriales de la enfermedad entre los 51 estados de los Estados Unidos (CDC BRFSS 2015, N=441.456 encuestados agregados con ponderación muestral) y las 24 jurisdicciones provinciales de la República Argentina (4ª Encuesta Nacional de Factores de Riesgo ENFR 2018 integrada con los Censos 2010/2022 y la Encuesta Permanente de Hogares del INDEC). Los resultados revelan una marcada divergencia estructural asociada a la arquitectura de los sistemas sanitarios: en los Estados Unidos, donde predomina un régimen fragmentado y de aseguramiento privado, la diabetes exhibe una correlación lineal consistente con el gradiente socioeconómico, donde los bajos ingresos (r = +0,81) y el sedentarismo (r = +0,79) concentran la morbimortalidad en el 'Cinturón de la Diabetes' del sur profundo, permitiendo modelos de regresión OLS con R² = 0,89 y Random Forest con R²_CV = 0,80. Por el contrario, en la Argentina la prevalencia provincial declarada no exhibe correlación con la pobreza monetaria (r = -0,05) ni con la falta de cobertura médica formal (r = -0,16). Esta discrepancia es analizada a la luz de dos mecanismos del sistema sanitario: en primer lugar, un severo sesgo de subdiagnóstico en provincias del norte (Chaco 10,3% de prevalencia con 39,7% de población jamás testeada), donde la carencia de screening preventivo invisibiliza la patología en encuestas autorreportadas; en segundo lugar, la función amortiguadora del subsistema público universal y programas estatales de provisión de fármacos (como el Programa Remediar), compatibles con el hecho de que distritos con más del 50% de población sin seguro médico formal alcancen coberturas terapéuticas superiores al 60% (Formosa 62,6%, Santa Cruz 70,0%). En el plano metodológico, se observa que los modelos supervisados de Machine Learning aplicados sobre agregaciones provinciales (N=24) experimentan una marcada pérdida de capacidad predictiva fuera de muestra frente al estimador baseline (LOOCV R² = -0,70; Random Forest R²_CV = -0,80), fundamentando la conveniencia de privilegiar atlas geoespaciales descriptivos y políticas focalizadas de pesquisa activa territorial frente al solucionismo predictivo.</w:t>
+        <w:t>La diabetes mellitus tipo 2 exhibe patrones territoriales heterogéneos modulados por los sistemas de salud. Este trabajo desarrolla un pipeline reproducible de ciencia de datos que compara los determinantes subnacionales de la enfermedad entre los 51 estados de los Estados Unidos (CDC BRFSS 2015, N=441.456 adultos ponderados) y las 24 jurisdicciones de la Argentina (4ª ENFR 2018 integrada con los Censos 2010/2022 y la EPH del INDEC). Los resultados sugieren una divergencia estructural: en los Estados Unidos, bajo un aseguramiento fragmentado de mercado, la prevalencia muestra fuerte autocorrelación espacial (I de Moran = +0,59; p &lt; 0,001) y asociación lineal con los bajos ingresos (r = +0,81; IC95% [+0,69; +0,89]) y la inactividad física (r = +0,79), logrando un ajuste robusto en regresión OLS (R² = 0,891; LOOCV R² = 0,859) y Random Forest (5-Fold R² = 0,802). En contraste, en la Argentina la prevalencia provincial declarada (media 13,0%, DE 2,1%) no se asocia linealmente con la pobreza monetaria (r = -0,05; IC95% [-0,44; +0,36]; ρ = -0,19) ni con la falta de cobertura formal (r = -0,16). Este desacople es analizado junto a factores concurrentes (estructura etaria y error muestral CV ≤ 12,5%) bajo dos hipótesis sanitarias: primero, el posible subdiagnóstico en provincias con alta pobreza estructural NBI, las cuales registran menor screening glucémico (r = -0,81; p &lt; 0,001), observándose que al excluir el outlier urbano de CABA (8,8% de prevalencia con 17,0% de obesidad y 92,9% de tamizaje) el screening correlaciona positivamente con la diabetes declarada (r = +0,40; p = 0,057); segundo, la ausencia de gradiente regresivo en el tratamiento farmacológico (r = -0,11; p = 0,62), donde jurisdicciones con más del 50% de población sin obra social (Santiago del Estero 56,0%, Formosa 55,9%, Chaco 52,2%) alcanzan coberturas terapéuticas del 54,2% al 62,6% mediante la red pública (Ley 26.914/PRODIABA y Programa Remediar), aunque persiste una brecha media nacional del 45,6%. Metodológicamente, con N=24 provincias tanto OLS (LOOCV R² = -0,701) como Ridge (R² = -0,311), regresiones univariadas (R² = -0,100) y Random Forest (5-Fold R² = -0,802) rinden por debajo de la media constante, sugiriendo priorizar atlas descriptivos y pesquisa activa frente al sobreajuste predictivo.</w:t>
       </w:r>
     </w:p>
     <w:p>
@@ -136,7 +136,7 @@
           <w:i/>
           <w:sz w:val="20"/>
         </w:rPr>
-        <w:t>diabetes mellitus; análisis comparativo; salud basada en datos; atlas geoespacial; subdiagnóstico; brecha de tratamiento; machine learning en salud; determinantes sociales.</w:t>
+        <w:t>diabetes mellitus; análisis comparativo; salud basada en datos; autocorrelación espacial; subdiagnóstico; cobertura de tratamiento; validación cruzada; determinantes sociales.</w:t>
       </w:r>
     </w:p>
     <w:p>
@@ -167,7 +167,7 @@
           <w:i w:val="0"/>
           <w:sz w:val="19"/>
         </w:rPr>
-        <w:t>Type 2 diabetes mellitus represents one of the most pressing public health and socioeconomic crises of the 21st century, exhibiting profoundly heterogeneous territorial distribution patterns that challenge computational epidemiology. This paper presents a reproducible health data science pipeline that empirically contrasts the territorial determinants of the disease between the 51 United States jurisdictions (CDC BRFSS 2015, N=441,456 individual microdata aggregated via sampling weights) and the 24 provinces of Argentina (4th National Risk Factor Survey ENFR 2018 integrated with the 2010/2022 National Censuses and the Permanent Household Survey EPH from INDEC). The findings demonstrate sharp structural divergences rooted in healthcare system design: in the United States, dominated by private market-driven healthcare, diabetes prevalence follows a marked linear gradient governed by socioeconomic deprivation, where low household income (r = +0.81) and physical inactivity (r = +0.79) heavily concentrate disease burden in the Southern 'Diabetes Belt', enabling multivariate OLS models to achieve R² = 0.89 and Random Forest algorithms to reach R²_CV = 0.80. In sharp contrast, in Argentina provincial self-reported prevalence exhibits no positive correlation with monetary poverty (r = -0.05) nor with the lack of formal health insurance (r = -0.16). This disconnect is analyzed under two structural healthcare dynamics: first, severe underdiagnosis in northern provinces (Chaco 10.3% prevalence with 39.7% of adults never tested), where the absence of clinical screening masks disease in self-reported surveys; second, the buffering role of universal public healthcare and essential drug programs (Remediar), consistent with vulnerable provinces with over 50% uninsured individuals reaching pharmacological treatment rates above 60%. Methodologically, we observe that supervised machine learning algorithms applied to provincial-level administrative aggregations (N=24) suffer a marked degradation in out-of-sample predictive performance relative to the naive baseline estimator (LOOCV R² = -0.70; Random Forest R²_CV = -0.80), highlighting the critical value of descriptive geospatial atlases and proactive clinical screening over fragile predictive formulations.</w:t>
+        <w:t>Type 2 diabetes mellitus exhibits heterogeneous spatial patterns shaped by healthcare system architecture. This study implements a reproducible health data science pipeline comparing subnational determinants across the 51 U.S. jurisdictions (CDC BRFSS 2015, N=441,456 weighted adults) and the 24 Argentine provinces (4th ENFR 2018 integrated with the 2010/2022 National Censuses and INDEC's EPH). Findings suggest a structural divergence: in the market-driven U.S. system, prevalence exhibits strong spatial autocorrelation (Moran's I = +0.59; p &lt; 0.001) and linear association with low household income (r = +0.81; 95% CI [+0.69, +0.89]) and leisure-time inactivity (r = +0.79), enabling strong performance in multivariate OLS (R² = 0.891; LOOCV R² = 0.859) and Random Forest (5-Fold R² = 0.802). Conversely, in Argentina provincial self-reported prevalence (mean 13.0%, SD 2.1%) shows no linear association with monetary poverty (r = -0.05; 95% CI [-0.44, +0.36]; Spearman ρ = -0.19) or lack of insurance (r = -0.16). Alongside demographic age structure and survey sampling variability (CV ≤ 12.5%), two healthcare mechanisms are examined: first, potential underdiagnosis in high-NBI provinces with lower glycemic screening (r = -0.81; p &lt; 0.001), noting that after excluding the CABA urban outlier (8.8% prevalence, 17.0% obesity, 92.9% screening), screening correlates positively with reported prevalence (r = +0.40; p = 0.057); second, the absence of a regressive gradient in pharmacological treatment (r = -0.11; p = 0.62), where provinces with &gt;50% uninsured population (Santiago del Estero 56.0%, Formosa 55.9%, Chaco 52.2%) reach 54.2%–62.6% active treatment coverage through public programs (Law 26,914/PRODIABA and Remediar), despite a 45.6% mean national treatment gap. Methodologically, at N=24, multivariate OLS (LOOCV R² = -0.701), Ridge (R² = -0.311), univariate models (R² = -0.100), and Random Forest (5-Fold R² = -0.802) underperform the naive baseline, supporting descriptive geospatial atlases over fragile predictive models.</w:t>
       </w:r>
     </w:p>
     <w:p>
@@ -192,7 +192,7 @@
           <w:i/>
           <w:sz w:val="20"/>
         </w:rPr>
-        <w:t>diabetes mellitus; comparative analysis; health data science; geospatial atlas; underdiagnosis; treatment gap; machine learning in health; social determinants.</w:t>
+        <w:t>diabetes mellitus; comparative analysis; health data science; spatial autocorrelation; underdiagnosis; treatment coverage; cross-validation; social determinants.</w:t>
       </w:r>
     </w:p>
     <w:p>
@@ -236,7 +236,7 @@
           <w:i w:val="0"/>
           <w:sz w:val="20"/>
         </w:rPr>
-        <w:t>La diabetes mellitus tipo 2 se ha consolidado como una auténtica pandemia no transmisible a escala global. Según los reportes consolidados del International Diabetes Federation (IDF) Diabetes Atlas en su 11.ª edición [1], más de 589 millones de adultos viven actualmente con la enfermedad en el mundo, proyectándose que esta cifra alcanzará los 852 millones hacia el año 2050. Este incremento exponencial no solo compromete la expectativa y calidad de vida de las poblaciones a través de secuelas cardiovasculares, renales y oftalmológicas, sino que impone una carga económica exorbitante sobre las finanzas públicas y los presupuestos familiares.</w:t>
+        <w:t>La diabetes mellitus tipo 2 se ha consolidado como una de las crisis sanitarias no transmisibles más relevantes a escala global [25]. Según las estimaciones de la 11.ª edición del International Diabetes Federation (IDF) Diabetes Atlas [1], los estudios poblacionales globales del consorcio NCD-RisC [2] y el Global Burden of Disease Study [3] publicados en The Lancet, más de 589 millones de adultos viven actualmente con la enfermedad en el mundo, proyectándose que esta cifra superará los 850 millones hacia el año 2050, mientras que las tasas globales de cobertura terapéutica permanecen rezagadas frente al crecimiento de la prevalencia [2], [3].</w:t>
       </w:r>
     </w:p>
     <w:p>
@@ -252,7 +252,7 @@
           <w:i w:val="0"/>
           <w:sz w:val="20"/>
         </w:rPr>
-        <w:t>Sin embargo, el impacto epidemiológico de la patología dista de manifestarse de manera homogénea. Existe un creciente consenso interdisciplinario en torno a que los Determinantes Sociales de la Salud (DSS) [4], [11] —tales como la disponibilidad y asequibilidad de alimentos frescos, las posibilidades materiales de realizar actividad física, el estrés crónico vinculado a la privación económica y el acceso efectivo a servicios diagnósticos y terapéuticos— modulan fuertemente la distribución espacial de la enfermedad.</w:t>
+        <w:t>El impacto epidemiológico de la patología dista de manifestarse de manera homogénea en el territorio. Existe consenso interdisciplinario en torno a que los Determinantes Sociales de la Salud (DSS) [4], [5], [6] —tales como la disponibilidad de alimentos saludables, las condiciones materiales para la actividad física, la privación socioeconómica y el acceso efectivo a servicios diagnósticos y farmacológicos— modulan la distribución espacial de la morbimortalidad en las Américas [4], [16].</w:t>
       </w:r>
     </w:p>
     <w:p>
@@ -268,7 +268,7 @@
           <w:i w:val="0"/>
           <w:sz w:val="20"/>
         </w:rPr>
-        <w:t>Desde la perspectiva de la ciencia de datos en salud (Health Data Science), un interrogante sustantivo radica en determinar si los patrones epidemiológicos observados en países desarrollados son directamente extrapolables a economías emergentes de América Latina. Frecuentemente, la literatura internacional asume de manera tácita que los modelos predictivos formulados en países anglosajones mantienen validez universal. No obstante, las diferencias estructurales en los sistemas de cobertura médica pública frente a esquemas privados de mercado plantean dinámicas territoriales diametralmente opuestas.</w:t>
+        <w:t>Desde la perspectiva de la ciencia de datos en salud (Health Data Science), un interrogante central consiste en evaluar si los patrones espaciales y los modelos predictivos formulados en economías desarrolladas con sistemas de salud privados son extrapolables a países de América Latina con sistemas públicos universales. Frecuentemente, la literatura de aprendizaje automático aplicado asume que los gradientes sociodemográficos observados en países anglosajones operan de forma análoga en cualquier latitud, soslayando el rol mediador de la arquitectura sanitaria.</w:t>
       </w:r>
     </w:p>
     <w:p>
@@ -284,7 +284,7 @@
           <w:i w:val="0"/>
           <w:sz w:val="20"/>
         </w:rPr>
-        <w:t>Por una parte, los Estados Unidos constituyen el arquetipo de un sistema de salud fragmentado y dependiente del empleo o de aseguradoras privadas, donde la capacidad diagnóstica se encuentra altamente tecnificada y extendida, pero el acceso a medicamentos esenciales (como la insulina y los análogos de GLP-1) queda supeditado a la capacidad financiera de los hogares [5], [12]. Por otra parte, la República Argentina sostiene un modelo mixto caracterizado por la presencia de un subsistema público universal con gratuidad irrestricta en el punto de atención y programas de provisión farmacológica masiva (v.g. Remediar), aunque condicionado por profundas asimetrías de infraestructura y distancias geográficas entre las regiones centrales y las provincias del norte y sur [3], [16].</w:t>
+        <w:t>Por una parte, los Estados Unidos constituyen el arquetipo de un sistema de salud fragmentado y dependiente del aseguramiento privado o laboral, donde la pesquisa bioquímica rutinaria está ampliamente extendida, pero la continuidad farmacológica (insulina e hipoglucemiantes) enfrenta severas barreras de copago y racionamiento por costo de bolsillo [6], [9], [10]. Por otra parte, la República Argentina sostiene un sistema mixto con un subsistema público de acceso universal y gratuito en el punto de atención, respaldado por la Guía de Práctica Clínica Nacional de DM2 [14], el marco normativo de cobertura integral de insulinas e insumos (PRODIABA / Ley N.º 26.914) y la distribución de hipoglucemiantes orales esenciales en centros de atención primaria mediante el Programa Nacional Remediar [15], aunque condicionado por marcadas asimetrías socioambientales y de infraestructura diagnóstica en el norte y las zonas rurales [13], [16], [17], [18].</w:t>
       </w:r>
     </w:p>
     <w:p>
@@ -300,7 +300,7 @@
           <w:i w:val="0"/>
           <w:sz w:val="20"/>
         </w:rPr>
-        <w:t>El objetivo primordial de este trabajo es implementar un pipeline reproducible de ciencia de datos para contrastar exhaustivamente la epidemiología geoespacial de la diabetes entre los 51 estados de los Estados Unidos y las 24 jurisdicciones de la Argentina. Específicamente se busca: (i) mapear bajo una escala cartográfica unificada la prevalencia territorial de la enfermedad; (ii) comparar la intensidad de las correlaciones bivariadas entre factores sociodemográficos y prevalencia; (iii) desentrañar la aparente paradoja entre gratuidad pública y subdiagnóstico en la Argentina frente a la barrera financiera estadounidense; y (iv) evaluar formalmente la transferibilidad de algoritmos supervisados de Machine Learning en muestras reducidas (N=24).</w:t>
+        <w:t>El objetivo de este trabajo es implementar un pipeline reproducible de ciencia de datos para contrastar empíricamente la epidemiología geoespacial de la diabetes entre los 51 estados de los Estados Unidos y las 24 jurisdicciones de la Argentina. Específicamente se propone: (i) analizar la distribución cartográfica y la autocorrelación espacial (Índice I de Moran) de la prevalencia en ambos países; (ii) contrastar las asociaciones paramétricas (Pearson con intervalos de confianza al 95%) y no paramétricas (Spearman) entre privación socioeconómica y prevalencia declarada; (iii) examinar el rol del tamizaje glucémico (screening), la sensibilidad a valores extremos urbanos (CABA) y la cobertura farmacológica; y (iv) evaluar los límites de generalización fuera de muestra de modelos lineales, regularizados (Ridge) y no lineales (Random Forest) bajo esquemas simétricos de validación cruzada en muestras agregadas pequeñas (N=24).</w:t>
       </w:r>
     </w:p>
     <w:p>
@@ -332,7 +332,7 @@
           <w:i w:val="0"/>
           <w:sz w:val="20"/>
         </w:rPr>
-        <w:t>El sustento teórico del estudio se fundamenta en el modelo de Determinantes Sociales de la Salud formalizado por la Organización Mundial de la Salud (OMS) [4] y la American Diabetes Association (ADA) [5]. Este marco postula que las patologías cardiometabólicas no son meros eventos biológicos individuales, sino el resultado acumulativo de condiciones materiales de vida que generan entornos obesogénicos y restringen las oportunidades de prevención primaria.</w:t>
+        <w:t>El marco conceptual se apoya en el modelo de Determinantes Sociales de la Salud de la Organización Mundial de la Salud (OMS) [25] y de la American Diabetes Association (ADA) [4], [6], así como en revisiones recientes sobre desigualdades estructurales y territoriales en diabetes [5]. Este enfoque postula que las patologías cardiometabólicas responden a exposiciones acumulativas vinculadas a la estructura socioeconómica y a la organización territorial de los servicios preventivos.</w:t>
       </w:r>
     </w:p>
     <w:p>
@@ -348,7 +348,7 @@
           <w:i w:val="0"/>
           <w:sz w:val="20"/>
         </w:rPr>
-        <w:t>En los Estados Unidos, una profusa literatura empírica ha documentado la existencia del denominado 'Cinturón de la Diabetes' (Diabetes Belt) [12], [13], localizado primordialmente en los estados del sudeste y la región de los Apalaches (Misisipi, Alabama, Virginia Occidental, Kentucky). Estudios a nivel de condado han comprobado que la concentración de minorías étnicas vulnerables, el desempleo estructural y la proliferación de desiertos alimentarios (food deserts) explican más del 80% de la varianza en la prevalencia estatal [13].</w:t>
+        <w:t>En los Estados Unidos, la literatura epidemiológica reciente del CDC y estudios geoespaciales a gran escala como los de Benavidez et al. [7] y Wittman et al. [8] han documentado la persistencia de un corredor de alta prevalencia ('Cinturón de la Diabetes') en los Apalaches y el sudeste estadounidense (Misisipi, Alabama, Virginia Occidental, Luisiana). Estas investigaciones confirman a escala subnacional que la superposición de privación económica, menor nivel educativo, barreras financieras y sedentarismo explica la mayor parte de la variabilidad territorial de la diabetes diagnosticada en dicho país [5], [7], [8].</w:t>
       </w:r>
     </w:p>
     <w:p>
@@ -364,7 +364,7 @@
           <w:i w:val="0"/>
           <w:sz w:val="20"/>
         </w:rPr>
-        <w:t>En la República Argentina, los antecedentes geoespaciales sobre diabetes son sustancialmente más acotados debido a la fragmentación de registros administrativos. Investigaciones seminales de Leveau et al. [15] identificaron conglomerados de alta mortalidad por diabetes en el centro y norte del país entre 1990 y 2012, sugiriendo que el contexto geográfico actúa como modificador del riesgo de fallecimiento. Asimismo, Marro et al. [16], [17] evidenciaron marcadas desigualdades interprovinciales en el acceso a consultas especializadas y complicaciones crónicas, señalando que la privación territorial incrementa sustancialmente el retraso diagnóstico.</w:t>
+        <w:t>En la República Argentina, las investigaciones recientes en epidemiología espacial y sanitaria han documentado brechas regionales y urbanas persistentes. Marro et al. [16] demostraron mediante modelos multinivel la influencia determinante del entorno socioambiental y las desigualdades territoriales sobre la prevalencia de diabetes en aglomerados argentinos, mientras que Elgart et al. [17] relevaron las barreras operativas, psicosociales y terapéuticas que enfrentan los equipos de salud y los pacientes en el país. Asimismo, estudios clínicos en contextos rurales argentinos, como el de Ortiz-Basso et al. [18], han advertido sobre las barreras geográficas para el diagnóstico y control oftalmológico temprano.</w:t>
       </w:r>
     </w:p>
     <w:p>
@@ -380,7 +380,7 @@
           <w:i w:val="0"/>
           <w:sz w:val="20"/>
         </w:rPr>
-        <w:t>En el plano metodológico, el análisis espacial de datos agregados enfrenta el riesgo constante del Problema de la Unidad de Área Modificable (MAUP) y la falacia ecológica [14]. La aplicación acrítica de modelos de Machine Learning sobre agregaciones macro (como provincias o estados) suele ignorar que la reducción del tamaño de muestra (N) degrada exponencialmente la potencia estadística, generando ilusiones de predictibilidad que no resisten la validación cruzada.</w:t>
+        <w:t>En el plano metodológico, la ciencia de datos geoespaciales contemporánea (Rey, Arribas-Bel y Wolf [19]) enfatiza que el análisis de agregaciones jurisdiccionales está sujeto al Problema de la Unidad de Área Modificable (MAUP), a la dependencia espacial entre unidades vecinas y al riesgo de falacia ecológica. A ello se suma que en el aprendizaje estadístico supervisado [20] y en las guías internacionales de reporte y validación de modelos en salud (Varoquaux y Cheplygina [21]; guía TRIPOD+AI de Collins et al. [22]), entrenar modelos multiparamétricos cuando la razón de observaciones por predictor es reducida (v.g., N=24 provincias con 5 covariables) incrementa drásticamente la varianza del estimador fuera de muestra, exigiendo contrastar cualquier algoritmo contra modelos parsimoniosos, regularizados y estimadores de referencia (naive baseline).</w:t>
       </w:r>
     </w:p>
     <w:p>
@@ -428,7 +428,7 @@
           <w:i w:val="0"/>
           <w:sz w:val="20"/>
         </w:rPr>
-        <w:t>Se procesaron los microdatos del Behavioral Risk Factor Surveillance System (BRFSS 2015) [6], relevados por los Centers for Disease Control and Prevention (CDC). La muestra contiene 441.456 entrevistas individuales aplicadas a población no institucionalizada de 18 años y más. Cada registro individual incorpora un factor de ponderación muestral (_LLCPWT) que calibra la muestra por edad, sexo y etnia, garantizando representatividad a escala de los 51 estados (50 estados y el Distrito de Columbia).</w:t>
+        <w:t>Se procesaron los microdatos públicos del Behavioral Risk Factor Surveillance System (BRFSS, corte armonizado 2015 del repositorio plurianual del CDC [11]), compuestos por 441.456 entrevistas a adultos no institucionalizados de 18 años y más. Aplicando el factor de ponderación muestral oficial (_LLCPWT), que calibra por estructura etaria, sexo y raza/etnia, se agregaron los indicadores representativos de las 51 jurisdicciones (50 estados y Washington D.C.).</w:t>
       </w:r>
     </w:p>
     <w:p>
@@ -444,7 +444,7 @@
           <w:i w:val="0"/>
           <w:sz w:val="20"/>
         </w:rPr>
-        <w:t>A partir de esta base se derivaron: prevalencia de diabetes diagnosticada (excluyendo diabetes gestacional); obesidad autorreportada (IMC≥30 derivado de peso y talla declarados, variable _BMI5CAT); sedentarismo o inactividad física (_TOTINDA); proporción de población en hogares con ingresos menores a USD 25.000 anuales (INCOME2); población sin educación secundaria completa (_EDUCAG); barrera económica para acceder a la consulta médica (MEDCOST); y tasa de adultos sin seguro médico (_HCVU651).</w:t>
+        <w:t>Se extrajeron: prevalencia de diabetes diagnosticada (variable DIABETE3, excluyendo diabetes gestacional y prediabetes declarada); obesidad autorreportada (IMC ≥ 30 kg/m², _BMI5CAT); inactividad física en el tiempo libre durante los últimos 30 días (_TOTINDA); porcentaje de adultos en hogares con ingresos anuales inferiores a USD 25.000 (INCOME2); adultos con educación secundaria incompleta (_EDUCAG); barrera económica para consultar al médico en el último año (MEDCOST); y adultos de 18 a 64 años sin seguro médico (_HCVU651).</w:t>
       </w:r>
     </w:p>
     <w:p>
@@ -476,7 +476,7 @@
           <w:i w:val="0"/>
           <w:sz w:val="20"/>
         </w:rPr>
-        <w:t>Para la República Argentina se consolidó un dataset representativo de las 24 jurisdicciones de primer orden (23 provincias y CABA) a partir de cuatro fuentes oficiales del INDEC y el Ministerio de Salud de la Nación [3]:</w:t>
+        <w:t>Para la República Argentina se construyó un dataset provincial de las 24 jurisdicciones (23 provincias y CABA) integrando los repositorios oficiales abiertos del INDEC [12], [13] y del Ministerio de Salud de la Nación [14], [15]:</w:t>
       </w:r>
     </w:p>
     <w:p>
@@ -492,7 +492,7 @@
           <w:i w:val="0"/>
           <w:sz w:val="20"/>
         </w:rPr>
-        <w:t>1. 4ª Encuesta Nacional de Factores de Riesgo (ENFR 2018): De sus cuadros definitivos se extrajeron la prevalencia de diabetes o glucemia elevada por autorreporte (Cuadro 7.3, derivado de la pregunta estandarizada sobre diagnóstico previo brindado por personal de salud) junto con su coeficiente de variación muestral (CV, todos inferiores al 12,5%, certificando confiabilidad estadística oficial); el porcentaje de personas con diabetes bajo tratamiento farmacológico activo con pastillas o insulina (Cuadro 7.5); la tasa de screening preventivo de glucemia alguna vez en la vida (Cuadro 7.1); obesidad autorreportada IMC≥30 (Cuadro 6.3); sedentarismo o inactividad física en tiempo libre (Cuadro 3.1); hipertensión arterial autorreportada (Cuadro 8.3); y consumo de frutas/verduras (Cuadro 5.7).</w:t>
+        <w:t>1. 4ª Encuesta Nacional de Factores de Riesgo (ENFR, repositorio de microdatos y tabulados definitivos del INDEC [13]): Con representatividad para la población urbana de 18 años y más (N=29.224 hogares efectivos en aglomerados de ≥5.000 habitantes, representativos de ~29,5 millones de adultos urbanos dentro de una población total nacional de ~44 millones), se extrajeron de sus cuadros definitivos: prevalencia de diabetes o glucemia elevada autorreportada por diagnóstico previo de personal de salud (Cuadro 7.3) y su coeficiente de variación muestral (CV, todos ≤12,5%); cobertura de tratamiento farmacológico activo (pastillas o insulina) entre personas con diabetes (Cuadro 7.5); tasa de screening glucémico alguna vez en la vida (Cuadro 7.1); obesidad autorreportada IMC ≥ 30 (Cuadro 6.3); y prevalencia de nivel bajo de actividad física según el cuestionario internacional IPAQ (Cuadro 3.1).</w:t>
       </w:r>
     </w:p>
     <w:p>
@@ -508,7 +508,7 @@
           <w:i w:val="0"/>
           <w:sz w:val="20"/>
         </w:rPr>
-        <w:t>2. Censo Nacional de Población, Hogares y Viviendas 2010 y 2022: Se incorporó la tasa de hogares con Necesidades Básicas Insatisfechas (NBI 2010, último relevamiento censal con dicho indicador); el porcentaje de población sin cobertura formal de salud por obra social o prepaga, dependiente exclusivamente del hospital público (Censo 2022, Hoja C1); y la densidad demográfica efectiva continental (hab/km²).</w:t>
+        <w:t>2. Censo Nacional de Población, Hogares y Viviendas 2022 y serie censal histórica (INDEC) [12]: Se incorporó el porcentaje de hogares con Necesidades Básicas Insatisfechas (NBI, serie censal histórica de privación estructural); el porcentaje de población sin cobertura formal por obra social ni prepaga, dependiente exclusivamente del subsistema público (Censo 2022, Cuadro C1) [12]; y la densidad demográfica continental transformada en escala logarítmica (log10 hab/km²).</w:t>
       </w:r>
     </w:p>
     <w:p>
@@ -524,7 +524,7 @@
           <w:i w:val="0"/>
           <w:sz w:val="20"/>
         </w:rPr>
-        <w:t>3. Encuesta Permanente de Hogares (EPH 2018, INDEC): Se extrajo la tasa de personas por debajo de la línea de pobreza monetaria correspondiente al segundo semestre de 2018 (Cuadro 4.3), promediando los aglomerados urbanos a nivel provincial para sincronizar temporalmente con la ENFR 2018.</w:t>
+        <w:t>3. Encuesta Permanente de Hogares (EPH, base de pobreza monetaria del INDEC [13]): Se relevó la incidencia de pobreza monetaria de personas bajo la línea de pobreza (Cuadro 4.3), promediando los aglomerados urbanos de cada jurisdicción en sincronía temporal con el operativo de la ENFR.</w:t>
       </w:r>
     </w:p>
     <w:p>
@@ -540,7 +540,7 @@
           <w:i w:val="0"/>
           <w:sz w:val="22"/>
         </w:rPr>
-        <w:t>3.3. Georreferenciación y modelado estadístico</w:t>
+        <w:t>3.3. Georreferenciación, autocorrelación espacial y modelado estadístico</w:t>
       </w:r>
     </w:p>
     <w:p>
@@ -556,7 +556,7 @@
           <w:i w:val="0"/>
           <w:sz w:val="20"/>
         </w:rPr>
-        <w:t>Las geometrías vectoriales de límites provinciales y estatales se homologaron bajo el estándar GeoJSON WGS84. Para Argentina se implementó un recuadro de magnificación cartográfica (inset zoom) centrado en el Área Metropolitana de Buenos Aires (CABA y conurbano) para subsanar la disparidad de escala geográfica frente a la Patagonia.</w:t>
+        <w:t>El procesamiento geoespacial y econométrico se implementó en Python utilizando GeoPandas [23], SciPy, Statsmodels y Scikit-learn [24] siguiendo los estándares de ciencia de datos geográficos de Rey et al. [19] (el código fuente completo, los datos crudos y las tablas procesadas se encuentran abiertos en el repositorio reproducible del proyecto: https://github.com/florr/Diabetes-Geografica-CIITI-2026). Para evaluar formalmente la dependencia geográfica más allá de la inspección visual, se calculó el Índice I de Moran global de autocorrelación espacial [19] sobre las matrices de pesos de contigüidad tipo Reina (Queen, vinculando a Tierra del Fuego con su vecino continental más próximo) con inferencia por 9.999 permutaciones de Monte Carlo.</w:t>
       </w:r>
     </w:p>
     <w:p>
@@ -572,7 +572,23 @@
           <w:i w:val="0"/>
           <w:sz w:val="20"/>
         </w:rPr>
-        <w:t>El pipeline analítico calculó matrices de correlación bivariada de Pearson (r). Para el modelado supervisado se estimaron regresiones múltiples por Mínimos Cuadrados Ordinarios (OLS) con errores estándar robustos a heterocedasticidad (HC3 de MacKinnon-White) y Factores de Inflación de Varianza (VIF). La capacidad predictiva real y la generalización fuera de muestra se evaluaron mediante esquemas de validación cruzada particionada: K-Fold (k=5, con barajado aleatorio y semilla fija random_state=42) para los 51 estados de EE.UU. y validación cruzada exhaustiva Leave-One-Out (LOOCV) para las 24 jurisdicciones argentinas. En ambos esquemas, los modelos se ajustaron exclusivamente sobre el conjunto de entrenamiento de cada partición y se evaluaron sobre el pliegue de prueba no observado, garantizando la total ausencia de filtración de información (data leakage). Asimismo, se incorporó un modelo de referencia ingenuo (dummy baseline) que predice la media del conjunto de entrenamiento dentro del mismo esquema particionado para contrastar formalmente la ganancia predictiva neta.</w:t>
+        <w:t>Para el análisis bivariado se reportan tanto el coeficiente paramétrico de Pearson (r) con sus intervalos de confianza al 95% (IC95% mediante transformación z de Fisher) como el coeficiente no paramétrico de rangos de Spearman (ρ), junto con un análisis de sensibilidad excluyendo a CABA (N=23) dado su carácter de valor extremo demográfico. En el modelado multivariado se estimaron regresiones por Mínimos Cuadrados Ordinarios (OLS) con errores estándar robustos a heterocedasticidad HC3 y Factores de Inflación de Varianza (VIF) [20].</w:t>
+      </w:r>
+    </w:p>
+    <w:p>
+      <w:pPr>
+        <w:spacing w:after="80" w:line="252" w:lineRule="auto"/>
+        <w:ind w:firstLine="227"/>
+        <w:jc w:val="both"/>
+      </w:pPr>
+      <w:r>
+        <w:rPr>
+          <w:rFonts w:ascii="Times New Roman" w:hAnsi="Times New Roman" w:eastAsia="Times New Roman"/>
+          <w:b w:val="0"/>
+          <w:i w:val="0"/>
+          <w:sz w:val="20"/>
+        </w:rPr>
+        <w:t>Para responder a las exigencias de comparabilidad predictiva y prevención de sesgos de evaluación [20], [21], [22], todos los algoritmos supervisados se evaluaron de manera estrictamente simétrica en ambos países bajo dos esquemas libres de filtración de datos (data leakage): validación cruzada exhaustiva Leave-One-Out (LOOCV) y validación cruzada en 5 pliegues (5-Fold CV, barajado con semilla fija random_state=42). Asimismo, además de OLS multivariado (5 predictores) y Random Forest Regressor [24], se evaluaron especificaciones parsimoniosas y regularizadas: regresión Ridge con penalización L2 (α=10 con estandarización interna por pliegue) y regresión OLS univariada (empleando únicamente obesidad como predictor), contrastando el error cuadrático (MSE) y absoluto medio (MAE) contra el estimador naive baseline de media constante.</w:t>
       </w:r>
     </w:p>
     <w:p>
@@ -588,7 +604,7 @@
           <w:i w:val="0"/>
           <w:sz w:val="22"/>
         </w:rPr>
-        <w:t>3.4. Justificación de fuentes, comparabilidad y consideraciones ecológicas</w:t>
+        <w:t>3.4. Comparabilidad de constructos y consideraciones metodológicas</w:t>
       </w:r>
     </w:p>
     <w:p>
@@ -604,7 +620,7 @@
           <w:i w:val="0"/>
           <w:sz w:val="20"/>
         </w:rPr>
-        <w:t>La integración de fuentes secundarias de distintos períodos responde a la disponibilidad oficial de datos estructurados: la ENFR 2018 constituye el último relevamiento nacional exhaustivo de factores de riesgo con desagregación provincial en Argentina, complementada con el Censo 2010 (último registro consolidado de NBI por jurisdicción) y el Censo 2022 (cobertura de salud actualizada). Para los Estados Unidos se recurrió al BRFSS 2015 como base abierta de referencia internacional previa a disrupciones de financiamiento sanitario.</w:t>
+        <w:t>Resulta imperativo explicitar las diferencias operativas entre los constructos relevados en ambos países para evitar sobreafirmaciones en la comparación directa:</w:t>
       </w:r>
     </w:p>
     <w:p>
@@ -620,7 +636,23 @@
           <w:i w:val="0"/>
           <w:sz w:val="20"/>
         </w:rPr>
-        <w:t>Desde el punto de vista metodológico, se contemplan tres aspectos analíticos centrales: (i) Comparabilidad de constructos: en ambas encuestas, la diabetes se operacionaliza de manera idéntica a través del autorreporte de diagnóstico médico previo en la población adulta de 18 años y más (excluyendo diabetes gestacional), tal como lo consignan el Cuadro 7.3 de la ENFR 2018 y la variable DIABETE3 del CDC BRFSS. De igual modo, la obesidad y el sedentarismo se derivan de definiciones operativas estandarizadas de índice de masa corporal (≥30) y ausencia de actividad física en tiempo libre. Si bien el BRFSS es telefónico asistido (CATI) y la ENFR es presencial en hogares, las ponderaciones muestrales calibran ambas fuentes para representar fielmente a la población adulta no institucionalizada. (ii) Heterogeneidad temporal: aunque coexisten registros de diferentes años (2010 a 2022), las disparidades territoriales estructurales exhiben una notable inercia histórica en el mediano plazo. (iii) Control de la falacia ecológica: las correlaciones y regresiones computadas operan a nivel macro territorial; en consecuencia, los hallazgos describen propiedades ecológicas de los sistemas de salud y no deben extrapolarse como inferencias causales individuales.</w:t>
+        <w:t>1. Diferencias en la definición de variables: (a) En el BRFSS (`DIABETE3`), la prevalencia excluye explícitamente la prediabetes declarada, mientras que la pregunta estandarizada de la ENFR (Cuadro 7.3) releva conjuntamente si un profesional médico le indicó tener 'diabetes o glucemia elevada'; esta mayor amplitud semántica contribuye a explicar por qué la media provincial argentina (13,0%) supera a la estadounidense (10,2%). (b) En actividad física, el BRFSS (`_TOTINDA`) mide la ausencia de ejercicio en el tiempo libre en el último mes (media 25,8%), mientras que la ENFR (Cuadro 3.1) clasifica el 'nivel bajo de actividad física' mediante el cuestionario multidominio IPAQ (media 46,2%); por ende, la brecha numérica entre ambos países refleja tanto hábitos poblacionales como instrumentos de medición distintos. (c) En privación económica y covariables de control, EE.UU. utiliza el umbral de ingresos familiares anuales menores a USD 25.000 y la tasa de educación secundaria incompleta, mientras que Argentina emplea la línea de pobreza monetaria de la EPH (canasta básica total regionalizada) y el logaritmo de la densidad poblacional (para capturar el contraste macrourbano de CABA, dado que el déficit educativo estructural ya integra el indicador censal de NBI). En las Tablas 2 y 4 ambos constructos se rotulan de forma diferenciada.</w:t>
+      </w:r>
+    </w:p>
+    <w:p>
+      <w:pPr>
+        <w:spacing w:after="80" w:line="252" w:lineRule="auto"/>
+        <w:ind w:firstLine="227"/>
+        <w:jc w:val="both"/>
+      </w:pPr>
+      <w:r>
+        <w:rPr>
+          <w:rFonts w:ascii="Times New Roman" w:hAnsi="Times New Roman" w:eastAsia="Times New Roman"/>
+          <w:b w:val="0"/>
+          <w:i w:val="0"/>
+          <w:sz w:val="20"/>
+        </w:rPr>
+        <w:t>2. Estructura etaria, error muestral y potencia estadística: Los cuadros provinciales publicados de la ENFR reportan tasas brutas sin estandarización directa por edad y presentan coeficientes de variación muestral (CV) de entre 5,3% y 12,5% (lo que implica errores estándar de ~1,0 a 1,8 puntos porcentuales). Asimismo, con N=24 jurisdicciones, una correlación observada de r = -0,05 posee un IC95% amplio de [-0,44; +0,36]. En consecuencia, la ausencia de significancia estadística a escala ecológica no equivale a una prueba cerrada de independencia biológica, sino a la acción conjunta de sesgos de detección, confusión por estructura demográfica y variabilidad muestral.</w:t>
       </w:r>
     </w:p>
     <w:p>
@@ -643,7 +675,7 @@
       <w:r>
         <w:drawing>
           <wp:inline xmlns:a="http://schemas.openxmlformats.org/drawingml/2006/main" xmlns:pic="http://schemas.openxmlformats.org/drawingml/2006/picture">
-            <wp:extent cx="5940000" cy="3423910"/>
+            <wp:extent cx="5940000" cy="3385161"/>
             <wp:docPr id="1" name="Picture 1"/>
             <wp:cNvGraphicFramePr>
               <a:graphicFrameLocks noChangeAspect="1"/>
@@ -664,7 +696,7 @@
                   <pic:spPr>
                     <a:xfrm>
                       <a:off x="0" y="0"/>
-                      <a:ext cx="5940000" cy="3423910"/>
+                      <a:ext cx="5940000" cy="3385161"/>
                     </a:xfrm>
                     <a:prstGeom prst="rect"/>
                   </pic:spPr>
@@ -687,20 +719,8 @@
           <w:i w:val="0"/>
           <w:sz w:val="18"/>
         </w:rPr>
-        <w:t>Figura 1. Atlas geoespacial comparativo de la prevalencia de diabetes mellitus (%): (a) Estados Unidos (CDC BRFSS 2015, N=51); (b) República Argentina (ENFR 2018 / INDEC, N=24) con recuadro ampliado para CABA. Escala cromática unificada común (6% a 18%).</w:t>
-      </w:r>
-    </w:p>
-    <w:p>
-      <w:pPr>
-        <w:sectPr>
-          <w:type w:val="continuous"/>
-          <w:pgSz w:w="11906" w:h="16838"/>
-          <w:pgMar w:top="1134" w:right="1134" w:bottom="1417" w:left="1134" w:header="0" w:footer="0" w:gutter="0"/>
-          <w:cols w:num="1" w:space="500"/>
-          <w:formProt w:val="0"/>
-          <w:docGrid w:linePitch="360"/>
-        </w:sectPr>
-      </w:pPr>
+        <w:t>Figura 1. Atlas geoespacial comparativo de la prevalencia de diabetes (%): (a) Estados Unidos (CDC BRFSS 2015, N=51; I de Moran = +0.59, p &lt; 0,001); (b) República Argentina (ENFR 2018 / INDEC, N=24; I de Moran = +0.33, p = 0.039) con recuadro ampliado para CABA.</w:t>
+      </w:r>
     </w:p>
     <w:p>
       <w:pPr>
@@ -714,7 +734,7 @@
           <w:i w:val="0"/>
           <w:sz w:val="18"/>
         </w:rPr>
-        <w:t>Tabla 1. Cuadro comparativo general de indicadores epidemiológicos, sociodemográficos y cobertura sanitaria entre Estados Unidos y la República Argentina.</w:t>
+        <w:t>Tabla 1. Cuadro comparativo general de indicadores epidemiológicos, espaciales y sanitarios entre Estados Unidos y la República Argentina.</w:t>
       </w:r>
     </w:p>
     <w:tbl>
@@ -773,7 +793,7 @@
                 <w:i w:val="0"/>
                 <w:sz w:val="17"/>
               </w:rPr>
-              <w:t>Estados Unidos (CDC BRFSS)</w:t>
+              <w:t>Estados Unidos (CDC BRFSS 2015)</w:t>
             </w:r>
           </w:p>
         </w:tc>
@@ -793,7 +813,7 @@
                 <w:i w:val="0"/>
                 <w:sz w:val="17"/>
               </w:rPr>
-              <w:t>Argentina (ENFR / INDEC)</w:t>
+              <w:t>Argentina (ENFR 2018 / INDEC)</w:t>
             </w:r>
           </w:p>
         </w:tc>
@@ -897,7 +917,7 @@
                 <w:i w:val="0"/>
                 <w:sz w:val="17"/>
               </w:rPr>
-              <w:t>~320 millones (441.456 enc.)</w:t>
+              <w:t>~320 millones (441.456 enc. 18+)</w:t>
             </w:r>
           </w:p>
         </w:tc>
@@ -917,7 +937,7 @@
                 <w:i w:val="0"/>
                 <w:sz w:val="17"/>
               </w:rPr>
-              <w:t>~44 millones (urbana 18+ años)</w:t>
+              <w:t>~44 mill. total (~29,5 mill. urbana 18+; N=29.224)</w:t>
             </w:r>
           </w:p>
         </w:tc>
@@ -959,7 +979,7 @@
                 <w:i w:val="0"/>
                 <w:sz w:val="17"/>
               </w:rPr>
-              <w:t>10.2% (desv. est. 1,8%) [Mediana 10,0%]</w:t>
+              <w:t>10.2% (DE 1.9%; Mediana 10.0%)</w:t>
             </w:r>
           </w:p>
         </w:tc>
@@ -979,7 +999,7 @@
                 <w:i w:val="0"/>
                 <w:sz w:val="17"/>
               </w:rPr>
-              <w:t>13.0% media prov. (12,7% total nacional)</w:t>
+              <w:t>13.0% media prov. (DE 2.1%; 12,7% nac.)</w:t>
             </w:r>
           </w:p>
         </w:tc>
@@ -1063,7 +1083,7 @@
                 <w:i w:val="0"/>
                 <w:sz w:val="17"/>
               </w:rPr>
-              <w:t>Prevalencia media obesidad</w:t>
+              <w:t>Autocorrelación espacial (I de Moran)</w:t>
             </w:r>
           </w:p>
         </w:tc>
@@ -1083,7 +1103,7 @@
                 <w:i w:val="0"/>
                 <w:sz w:val="17"/>
               </w:rPr>
-              <w:t>29.3% media est. (28,6% total nac.)</w:t>
+              <w:t>I = +0.59 (p &lt; 0,001; fuerte clustering)</w:t>
             </w:r>
           </w:p>
         </w:tc>
@@ -1103,7 +1123,7 @@
                 <w:i w:val="0"/>
                 <w:sz w:val="17"/>
               </w:rPr>
-              <w:t>26.7% media prov. (25,6% total nac.)</w:t>
+              <w:t>I = +0.33 (p = 0.039; moderado)</w:t>
             </w:r>
           </w:p>
         </w:tc>
@@ -1125,7 +1145,7 @@
                 <w:i w:val="0"/>
                 <w:sz w:val="17"/>
               </w:rPr>
-              <w:t>Prevalencia sedentarismo</w:t>
+              <w:t>Prevalencia media obesidad (IMC≥30)</w:t>
             </w:r>
           </w:p>
         </w:tc>
@@ -1145,7 +1165,7 @@
                 <w:i w:val="0"/>
                 <w:sz w:val="17"/>
               </w:rPr>
-              <w:t>25.8% media est. (23,8% total nac.)</w:t>
+              <w:t>29.3% media est. (28,6% total nac.)</w:t>
             </w:r>
           </w:p>
         </w:tc>
@@ -1165,7 +1185,7 @@
                 <w:i w:val="0"/>
                 <w:sz w:val="17"/>
               </w:rPr>
-              <w:t>46.2% media prov. (45,9% total nac.)</w:t>
+              <w:t>26.7% media prov. (25,6% total nac.)</w:t>
             </w:r>
           </w:p>
         </w:tc>
@@ -1187,7 +1207,7 @@
                 <w:i w:val="0"/>
                 <w:sz w:val="17"/>
               </w:rPr>
-              <w:t>Población sin seguro médico</w:t>
+              <w:t>Inactividad física / Baja act. (IPAQ)</w:t>
             </w:r>
           </w:p>
         </w:tc>
@@ -1207,7 +1227,7 @@
                 <w:i w:val="0"/>
                 <w:sz w:val="17"/>
               </w:rPr>
-              <w:t>11.0% media est. (10,9% total nac.)</w:t>
+              <w:t>25.8% tiempo libre (23,8% nac.)</w:t>
             </w:r>
           </w:p>
         </w:tc>
@@ -1227,7 +1247,7 @@
                 <w:i w:val="0"/>
                 <w:sz w:val="17"/>
               </w:rPr>
-              <w:t>37.3% media prov. (35,6% total censo)</w:t>
+              <w:t>46.2% baja act. IPAQ (45,9% nac.)</w:t>
             </w:r>
           </w:p>
         </w:tc>
@@ -1249,7 +1269,7 @@
                 <w:i w:val="0"/>
                 <w:sz w:val="17"/>
               </w:rPr>
-              <w:t>Tasa de screening glucémico</w:t>
+              <w:t>Población sin seguro médico formal</w:t>
             </w:r>
           </w:p>
         </w:tc>
@@ -1269,7 +1289,7 @@
                 <w:i w:val="0"/>
                 <w:sz w:val="17"/>
               </w:rPr>
-              <w:t>&gt;85% (pesquisa clínica rutinaria)</w:t>
+              <w:t>11.0% media est. (10,9% total nac.)</w:t>
             </w:r>
           </w:p>
         </w:tc>
@@ -1289,7 +1309,7 @@
                 <w:i w:val="0"/>
                 <w:sz w:val="17"/>
               </w:rPr>
-              <w:t>Media 74,8% (60,3% Chaco a 92,9% CABA)</w:t>
+              <w:t>37.3% media prov. (35,6% Censo 2022)</w:t>
             </w:r>
           </w:p>
         </w:tc>
@@ -1311,7 +1331,7 @@
                 <w:i w:val="0"/>
                 <w:sz w:val="17"/>
               </w:rPr>
-              <w:t>Brecha de tratamiento activo</w:t>
+              <w:t>Tasa de screening glucémico</w:t>
             </w:r>
           </w:p>
         </w:tc>
@@ -1331,7 +1351,7 @@
                 <w:i w:val="0"/>
                 <w:sz w:val="17"/>
               </w:rPr>
-              <w:t>Barrera de costo farmacológico / copago</w:t>
+              <w:t>&gt;85% (pesquisa clínica rutinaria)</w:t>
             </w:r>
           </w:p>
         </w:tc>
@@ -1351,7 +1371,69 @@
                 <w:i w:val="0"/>
                 <w:sz w:val="17"/>
               </w:rPr>
-              <w:t>Media 54,4% (32,7% La Pampa a 70,0% Santa Cruz)</w:t>
+              <w:t>Media 74.3% (60,3% Chaco a 92,9% CABA)</w:t>
+            </w:r>
+          </w:p>
+        </w:tc>
+      </w:tr>
+      <w:tr>
+        <w:tc>
+          <w:tcPr>
+            <w:tcW w:type="dxa" w:w="3213"/>
+          </w:tcPr>
+          <w:p>
+            <w:pPr>
+              <w:spacing w:after="30" w:before="30"/>
+              <w:jc w:val="left"/>
+            </w:pPr>
+            <w:r>
+              <w:rPr>
+                <w:rFonts w:ascii="Times New Roman" w:hAnsi="Times New Roman" w:eastAsia="Times New Roman"/>
+                <w:b w:val="0"/>
+                <w:i w:val="0"/>
+                <w:sz w:val="17"/>
+              </w:rPr>
+              <w:t>Cobertura de tratamiento (y brecha)</w:t>
+            </w:r>
+          </w:p>
+        </w:tc>
+        <w:tc>
+          <w:tcPr>
+            <w:tcW w:type="dxa" w:w="3213"/>
+          </w:tcPr>
+          <w:p>
+            <w:pPr>
+              <w:spacing w:after="30" w:before="30"/>
+              <w:jc w:val="center"/>
+            </w:pPr>
+            <w:r>
+              <w:rPr>
+                <w:rFonts w:ascii="Times New Roman" w:hAnsi="Times New Roman" w:eastAsia="Times New Roman"/>
+                <w:b w:val="0"/>
+                <w:i w:val="0"/>
+                <w:sz w:val="17"/>
+              </w:rPr>
+              <w:t>Barrera de costo médico / copago (media 13,2%)</w:t>
+            </w:r>
+          </w:p>
+        </w:tc>
+        <w:tc>
+          <w:tcPr>
+            <w:tcW w:type="dxa" w:w="3213"/>
+          </w:tcPr>
+          <w:p>
+            <w:pPr>
+              <w:spacing w:after="30" w:before="30"/>
+              <w:jc w:val="center"/>
+            </w:pPr>
+            <w:r>
+              <w:rPr>
+                <w:rFonts w:ascii="Times New Roman" w:hAnsi="Times New Roman" w:eastAsia="Times New Roman"/>
+                <w:b w:val="0"/>
+                <w:i w:val="0"/>
+                <w:sz w:val="17"/>
+              </w:rPr>
+              <w:t>Cobertura 53.9% [Brecha 46.1%] (32,7%–70,0%)</w:t>
             </w:r>
           </w:p>
         </w:tc>
@@ -1403,7 +1485,7 @@
           <w:i w:val="0"/>
           <w:sz w:val="22"/>
         </w:rPr>
-        <w:t>4.1. Atlas geoespacial y disparidad territorial</w:t>
+        <w:t>4.1. Atlas geoespacial y autocorrelación espacial (I de Moran)</w:t>
       </w:r>
     </w:p>
     <w:p>
@@ -1419,7 +1501,7 @@
           <w:i w:val="0"/>
           <w:sz w:val="20"/>
         </w:rPr>
-        <w:t>La visualización cartográfica bajo una escala cromática normalizada común (6% a 18%, Figura 1) pone de manifiesto contrastes territoriales de primer orden. En los Estados Unidos (Figura 1a), la prevalencia media interestatal es del 10,2% (desv. est. 1,8%), con una marcada polarización geográfica: los estados del 'Cinturón de la Diabetes' en el sudeste (Misisipi 14,8%, Virginia Occidental 14,5%, Alabama 13,6%, Luisiana 12,9%) presentan tasas que duplican las de distritos prósperos del oeste y norte como Colorado (6,8%), Utah (7,1%), Montana (7,7%) y Minnesota (8,0%).</w:t>
+        <w:t>La representación cartográfica bajo una escala común (6% a 18%, Figura 1) y las pruebas de autocorrelación espacial revelan patrones territoriales diferenciados. En los Estados Unidos (Figura 1a), la prevalencia media estatal es del 10.2% (DE 1.9%; mediana 10.0%), exhibiendo una autocorrelación espacial positiva altamente significativa (Índice I de Moran = +0.59; p &lt; 0,001). Este agrupamiento confirma la consolidación geográfica del corredor de alta prevalencia en el sudeste y los Apalaches documentado en la literatura reciente [7], [8] (Misisipi 14,8%, Virginia Occidental 14,5%, Alabama 13,6%, Luisiana 12,9%), duplicando los registros de estados del oeste y norte como Colorado (6,8%) y Utah (7,1%).</w:t>
       </w:r>
     </w:p>
     <w:p>
@@ -1435,7 +1517,7 @@
           <w:i w:val="0"/>
           <w:sz w:val="20"/>
         </w:rPr>
-        <w:t>En la República Argentina (Figura 1b), la prevalencia media interprovincial se sitúa en el 13,0% (desv. est. 2,3%), mientras que el total nacional ponderado por población reportado en el informe definitivo de la ENFR 2018 asciende al 12,7% [3]. No obstante, la dispersión subnacional desafía los patrones convencionales: las tasas más elevadas se concentran en las regiones de Cuyo y Centro (San Luis 17,3%, San Juan 15,9%, La Rioja 15,1% y La Pampa 14,6%), mientras que la Ciudad Autónoma de Buenos Aires (CABA) registra el mínimo nacional (8,8%), compartiendo valores deprimidos con jurisdicciones de alta vulnerabilidad del norte como Jujuy (8,9%) y Chaco (10,3%).</w:t>
+        <w:t>En la República Argentina (Figura 1b), la media simple de las 24 jurisdicciones es del 13.0% (con desvío estándar muestral de 2.1% y desvío estándar poblacional de 2.06%, coherente con una varianza poblacional exacta de Var(y) = 4.24), mientras que el total nacional ponderado es del 12,7% [13]. La autocorrelación espacial resulta moderada (I de Moran = +0.33; p = 0.039), impulsada por valores elevados en Cuyo y la región pampeana occidental (San Luis 17,3%, San Juan 15,9%, La Rioja 15,1%, La Pampa 14,6%). Por el contrario, CABA registra el mínimo nacional (8,8%), seguida por provincias del norte con alta vulnerabilidad estructural como Jujuy (8,9%), Chaco (10,3%), Salta (10,8%) y Entre Ríos (10,8%).</w:t>
       </w:r>
     </w:p>
     <w:p>
@@ -1458,7 +1540,7 @@
       <w:r>
         <w:drawing>
           <wp:inline xmlns:a="http://schemas.openxmlformats.org/drawingml/2006/main" xmlns:pic="http://schemas.openxmlformats.org/drawingml/2006/picture">
-            <wp:extent cx="5940000" cy="4455626"/>
+            <wp:extent cx="5940000" cy="4182437"/>
             <wp:docPr id="2" name="Picture 2"/>
             <wp:cNvGraphicFramePr>
               <a:graphicFrameLocks noChangeAspect="1"/>
@@ -1479,7 +1561,7 @@
                   <pic:spPr>
                     <a:xfrm>
                       <a:off x="0" y="0"/>
-                      <a:ext cx="5940000" cy="4455626"/>
+                      <a:ext cx="5940000" cy="4182437"/>
                     </a:xfrm>
                     <a:prstGeom prst="rect"/>
                   </pic:spPr>
@@ -1502,7 +1584,7 @@
           <w:i w:val="0"/>
           <w:sz w:val="18"/>
         </w:rPr>
-        <w:t>Figura 2. Distribución geoespacial de factores de riesgo cardiometabólicos: (a) Obesidad en EE.UU.; (b) Obesidad en Argentina; (c) Inactividad física en EE.UU.; (d) Inactividad física en Argentina.</w:t>
+        <w:t>Figura 2. Distribución geoespacial de factores cardiometabólicos: (a) Obesidad en EE.UU.; (b) Obesidad en Argentina; (c) Inactividad física en tiempo libre en EE.UU. (_TOTINDA); (d) Baja actividad física en Argentina (IPAQ).</w:t>
       </w:r>
     </w:p>
     <w:p>
@@ -1530,7 +1612,7 @@
           <w:i w:val="0"/>
           <w:sz w:val="22"/>
         </w:rPr>
-        <w:t>4.2. Atlas de factores cardiometabólicos</w:t>
+        <w:t>4.2. Atlas de factores cardiometabólicos y diferencias operativas</w:t>
       </w:r>
     </w:p>
     <w:p>
@@ -1546,7 +1628,7 @@
           <w:i w:val="0"/>
           <w:sz w:val="20"/>
         </w:rPr>
-        <w:t>La distribución espacial de la obesidad y la inactividad física (Figura 2) exhibe una asimetría estructural entre ambos países. En los Estados Unidos (Figuras 2a y 2c), la obesidad promedia el 29,3% a escala interestatal (28,6% a escala nacional ponderada) y el sedentarismo alcanza una media del 25,8% (23,8% nacional), alineándose con una correlación espacial consistente con la prevalencia de diabetes: los estados del sur profundo lideran de manera sincrónica en sobrepeso e inactividad motriz.</w:t>
+        <w:t>La Figura 2 contrasta los factores de riesgo cardiometabólicos. En los Estados Unidos (Figuras 2a y 2c), la obesidad autorreportada promedia el 29.3% estatal (28,6% nacional) y la inactividad física en tiempo libre promedia el 25.8% (23,8% nacional), mostrando una estrecha correspondencia geográfica con el mapa de diabetes del sur profundo.</w:t>
       </w:r>
     </w:p>
     <w:p>
@@ -1562,7 +1644,7 @@
           <w:i w:val="0"/>
           <w:sz w:val="20"/>
         </w:rPr>
-        <w:t>En la Argentina (Figuras 2b y 2d), la obesidad interprovincial promedia el 26,7% (25,6% nacional, oscilando entre 17,0% en CABA hasta 34,4% en San Juan y 34,0% en Santa Cruz). En contraste, la inactividad física alcanza guarismos alarmantes con una media provincial del 46,2% (45,9% nacional) y picos extremos en provincias como Formosa (69,1%) y La Rioja (61,2%), casi duplicando los niveles estadounidenses y evidenciando que el sedentarismo constituye un factor de riesgo generalizado a lo largo del territorio nacional.</w:t>
+        <w:t>En la Argentina (Figuras 2b y 2d), la obesidad provincial promedia el 26.7% (25,6% nacional), con mínimo en CABA (17,0%) y máximos en San Juan (34,4%) y Santa Cruz (34,0%). En cuanto al indicador de baja actividad física relevado mediante cuestionario IPAQ (Figura 2d), la media provincial asciende al 46.2% (45,9% nacional), con picos en Formosa (69,1%) y La Rioja (61,2%). Como se advirtió en la Sección 3.4, si bien este indicador evidencia una alta prevalencia de hipocinesia en la Argentina, su magnitud absoluta no debe compararse de forma lineal con el indicador estadounidense debido a las diferencias metodológicas entre el instrumento multidominio IPAQ y la pregunta simple de ejercicio recreativo del BRFSS.</w:t>
       </w:r>
     </w:p>
     <w:p>
@@ -1585,7 +1667,7 @@
       <w:r>
         <w:drawing>
           <wp:inline xmlns:a="http://schemas.openxmlformats.org/drawingml/2006/main" xmlns:pic="http://schemas.openxmlformats.org/drawingml/2006/picture">
-            <wp:extent cx="5760000" cy="2797058"/>
+            <wp:extent cx="5760000" cy="2909171"/>
             <wp:docPr id="3" name="Picture 3"/>
             <wp:cNvGraphicFramePr>
               <a:graphicFrameLocks noChangeAspect="1"/>
@@ -1606,7 +1688,7 @@
                   <pic:spPr>
                     <a:xfrm>
                       <a:off x="0" y="0"/>
-                      <a:ext cx="5760000" cy="2797058"/>
+                      <a:ext cx="5760000" cy="2909171"/>
                     </a:xfrm>
                     <a:prstGeom prst="rect"/>
                   </pic:spPr>
@@ -1629,7 +1711,7 @@
           <w:i w:val="0"/>
           <w:sz w:val="18"/>
         </w:rPr>
-        <w:t>Figura 3. Matrices de calor de correlaciones bivariadas de Pearson (r): (a) Estados Unidos; (b) República Argentina.</w:t>
+        <w:t>Figura 3. Matrices de calor de correlaciones bivariadas de Pearson (r): (a) Estados Unidos (N=51); (b) República Argentina (N=24).</w:t>
       </w:r>
     </w:p>
     <w:p>
@@ -1644,7 +1726,7 @@
           <w:i w:val="0"/>
           <w:sz w:val="18"/>
         </w:rPr>
-        <w:t>Tabla 2. Coeficientes de regresión lineal múltiple OLS con errores estándar robustos a heterocedasticidad (HC3) y factores de inflación de varianza (VIF).</w:t>
+        <w:t>Tabla 2. Coeficientes de regresión lineal múltiple OLS con errores estándar robustos a heterocedasticidad (HC3) y factores VIF.</w:t>
       </w:r>
     </w:p>
     <w:tbl>
@@ -1685,7 +1767,7 @@
                 <w:i w:val="0"/>
                 <w:sz w:val="17"/>
               </w:rPr>
-              <w:t>Determinante Sociodemográfico</w:t>
+              <w:t>Determinante Sociodemográfico (Constructo específico por país)</w:t>
             </w:r>
           </w:p>
         </w:tc>
@@ -1827,7 +1909,7 @@
                 <w:i w:val="0"/>
                 <w:sz w:val="17"/>
               </w:rPr>
-              <w:t>-</w:t>
+              <w:t>—</w:t>
             </w:r>
           </w:p>
         </w:tc>
@@ -1867,7 +1949,7 @@
                 <w:i w:val="0"/>
                 <w:sz w:val="17"/>
               </w:rPr>
-              <w:t>-</w:t>
+              <w:t>—</w:t>
             </w:r>
           </w:p>
         </w:tc>
@@ -1889,7 +1971,7 @@
                 <w:i w:val="0"/>
                 <w:sz w:val="17"/>
               </w:rPr>
-              <w:t>Obesidad (%)</w:t>
+              <w:t>Obesidad IMC≥30 (%)</w:t>
             </w:r>
           </w:p>
         </w:tc>
@@ -1991,7 +2073,7 @@
                 <w:i w:val="0"/>
                 <w:sz w:val="17"/>
               </w:rPr>
-              <w:t>Sedentarismo (%)</w:t>
+              <w:t>Inactividad T. Libre (US) / Baja Act. IPAQ (Arg) (%)</w:t>
             </w:r>
           </w:p>
         </w:tc>
@@ -2093,7 +2175,7 @@
                 <w:i w:val="0"/>
                 <w:sz w:val="17"/>
               </w:rPr>
-              <w:t>Pobreza / Bajos Ingresos (%)</w:t>
+              <w:t>Ingresos &lt;USD 25k (US) / Pobreza EPH (Arg) (%)</w:t>
             </w:r>
           </w:p>
         </w:tc>
@@ -2195,7 +2277,7 @@
                 <w:i w:val="0"/>
                 <w:sz w:val="17"/>
               </w:rPr>
-              <w:t>Sin Cobertura Privada / OS (%)</w:t>
+              <w:t>Sin Seguro 18–64 (US) / Sin OS ni Prepaga (Arg) (%)</w:t>
             </w:r>
           </w:p>
         </w:tc>
@@ -2297,7 +2379,7 @@
                 <w:i w:val="0"/>
                 <w:sz w:val="17"/>
               </w:rPr>
-              <w:t>Educación / Densidad</w:t>
+              <w:t>Secundario Incompleto (US, %) / Densidad log10 (Arg)</w:t>
             </w:r>
           </w:p>
         </w:tc>
@@ -2413,7 +2495,7 @@
           <w:i w:val="0"/>
           <w:sz w:val="22"/>
         </w:rPr>
-        <w:t>4.3. Matriz de correlaciones y determinantes sociales</w:t>
+        <w:t>4.3. Correlaciones paramétricas (IC95%), no paramétricas (Spearman) y OLS</w:t>
       </w:r>
     </w:p>
     <w:p>
@@ -2429,7 +2511,7 @@
           <w:i w:val="0"/>
           <w:sz w:val="20"/>
         </w:rPr>
-        <w:t>El análisis correlacional (Figura 3 y Tabla 2) expone la discrepancia empírica más contundente del trabajo. En los Estados Unidos, los coeficientes bivariados confirman una marcada asociación lineal con el gradiente socioeconómico: la privación de ingresos se asocia positivamente a la diabetes con r = +0,81 (p &lt; 0,001), el sedentarismo con r = +0,79 (p &lt; 0,001), el bajo nivel educativo con r = +0,77 (p &lt; 0,001) y la obesidad con r = +0,75 (p &lt; 0,001). En el modelo OLS multivariado (Tabla 2), la obesidad (β = +0,180; p &lt; 0,001), los bajos ingresos (β = +0,137; p = 0,004), la educación incompleta (β = +0,202; p = 0,001) y el sedentarismo (β = +0,095; p = 0,026) retienen significancia estadística robusta bajo errores HC3, con factores VIF controlados (&lt;5) y un ajuste global R² = 0,891 (F = 73,7; p &lt; 0,001).</w:t>
+        <w:t>El análisis correlacional (Figura 3 y Tabla 2) expone un marcado contraste entre ambos países. En los Estados Unidos (N=51), tanto las correlaciones lineales de Pearson como las de rangos de Spearman confirman un fuerte gradiente socioeconómico positivo: la proporción de hogares con bajos ingresos (&lt;USD 25k) se asocia a la diabetes con r = +0.81 (p &lt; 0,001; IC95% [+0.69; +0.89]; Spearman ρ = +0.80), la inactividad física con r = +0.79 (p &lt; 0,001; IC95% [+0.65; +0.87]; ρ = +0.74), la educación secundaria incompleta con r = +0.77 (p &lt; 0,001; IC95% [+0.63; +0.86]; ρ = +0.81) y la obesidad con r = +0.75 (p &lt; 0,001; IC95% [+0.60; +0.85]; ρ = +0.70). En el modelo OLS multivariado con errores robustos HC3 [20] (Tabla 2), la obesidad (β = +0,180; p &lt; 0,001), los bajos ingresos (β = +0,137; p = 0,004), el secundario incompleto (β = +0,202; p = 0,001) y la inactividad física (β = +0,095; p = 0,026) conservan significancia estadística con factores VIF controlados (&lt;5) y un ajuste global de R² = 0.891 (R²_adj = 0.878; F = 73.3; p &lt; 0,001).</w:t>
       </w:r>
     </w:p>
     <w:p>
@@ -2445,7 +2527,7 @@
           <w:i w:val="0"/>
           <w:sz w:val="20"/>
         </w:rPr>
-        <w:t>En contraste, en la República Argentina los factores socioeconómicos convencionales se desacoplan de la prevalencia declarada: la pobreza de la EPH arroja r = -0,05 (p = 0,82), las Necesidades Básicas Insatisfechas r = -0,26 (p = 0,22) y la falta de cobertura médica formal r = -0,16 (p = 0,44). En la regresión lineal múltiple (Tabla 2), ninguno de los coeficientes individuales alcanza significancia estadística formal al 5% (obesidad β = +0,053, p=0,83; pobreza β = +0,017, p=0,89; sedentarismo β = -0,002, p=0,98; sin cobertura β = -0,056, p=0,56; log densidad β = -1,162, p=0,40), y el modelo en su conjunto no resulta estadísticamente significativo (F = 1,29; p = 0,31; R² = 0,264; R²_adj = 0,059).</w:t>
+        <w:t>En contrapartida, en la República Argentina (N=24) la prevalencia provincial declarada no exhibe asociación lineal ni monótona positiva con los indicadores de privación: la pobreza monetaria EPH arroja r = -0.05 (p = 0.82; IC95% [-0.44; +0.36]; Spearman ρ = -0.19, p = 0.38), las Necesidades Básicas Insatisfechas (NBI) registran r = -0.22 (p = 0.30; IC95% [-0.57; +0.20]; ρ = -0.19) y la proporción de población sin cobertura de obra social ni prepaga muestra r = -0.16 (p = 0.47; IC95% [-0.53; +0.26]; ρ = -0.22). Incluso la obesidad presenta una asociación bivariada moderada y no significativa al 5% (r = +0.34; p = 0.11; IC95% [-0.08; +0.65]). En la regresión múltiple OLS (Tabla 2), ningún regresor resulta estadísticamente significativo y el modelo global carece de significancia conjunta (F = 1.29; p = 0.31; R² = 0.264; R²_adj = 0.059).</w:t>
       </w:r>
     </w:p>
     <w:p>
@@ -2468,7 +2550,7 @@
       <w:r>
         <w:drawing>
           <wp:inline xmlns:a="http://schemas.openxmlformats.org/drawingml/2006/main" xmlns:pic="http://schemas.openxmlformats.org/drawingml/2006/picture">
-            <wp:extent cx="5940000" cy="2789141"/>
+            <wp:extent cx="5940000" cy="2786963"/>
             <wp:docPr id="4" name="Picture 4"/>
             <wp:cNvGraphicFramePr>
               <a:graphicFrameLocks noChangeAspect="1"/>
@@ -2489,7 +2571,7 @@
                   <pic:spPr>
                     <a:xfrm>
                       <a:off x="0" y="0"/>
-                      <a:ext cx="5940000" cy="2789141"/>
+                      <a:ext cx="5940000" cy="2786963"/>
                     </a:xfrm>
                     <a:prstGeom prst="rect"/>
                   </pic:spPr>
@@ -2512,7 +2594,7 @@
           <w:i w:val="0"/>
           <w:sz w:val="18"/>
         </w:rPr>
-        <w:t>Figura 4. Disparidad asistencial: (a) Ranking de brecha de tratamiento farmacológico en Argentina (ENFR); (b) Diagrama de dispersión de barrera de costo médico vs. prevalencia en EE.UU.</w:t>
+        <w:t>Figura 4. Cobertura y barreras asistenciales: (a) Cobertura provincial de tratamiento farmacológico activo en Argentina (media 53.9%, brecha 46.1%); (b) Barrera de costo médico vs. prevalencia en EE.UU.</w:t>
       </w:r>
     </w:p>
     <w:p>
@@ -2540,7 +2622,7 @@
           <w:i w:val="0"/>
           <w:sz w:val="22"/>
         </w:rPr>
-        <w:t>4.4. La aparente paradoja: Detección vs. Tratamiento</w:t>
+        <w:t>4.4. Detección, sensibilidad al outlier CABA, factores concurrentes y tratamiento</w:t>
       </w:r>
     </w:p>
     <w:p>
@@ -2556,7 +2638,7 @@
           <w:i w:val="0"/>
           <w:sz w:val="20"/>
         </w:rPr>
-        <w:t>Para interpretar por qué en la Argentina las provincias con mayor privación material reportan tasas de diabetes autorreportada similares o inferiores a las de regiones más favorecidas, resulta indispensable descomponer la dinámica asistencial en dos etapas secuenciales: detección diagnóstica (screening) y cobertura farmacológica activa (Figura 4 y Figura 5b):</w:t>
+        <w:t>Para comprender por qué las provincias argentinas con mayor privación estructural no registran mayores tasas de diabetes autorreportada, el análisis empírico evalúa los eslabones de detección (screening), el efecto de valores extremos (CABA), las explicaciones demográficas/muestrales alternativas y la cobertura de tratamiento (Figuras 4 y 5b):</w:t>
       </w:r>
     </w:p>
     <w:p>
@@ -2572,7 +2654,7 @@
           <w:i w:val="0"/>
           <w:sz w:val="20"/>
         </w:rPr>
-        <w:t>1. La barrera de prevención y la hipótesis del subdiagnóstico: Al tratarse de una patología frecuentemente asintomática en sus estadios iniciales, la identificación clínica depende del acceso efectivo a análisis bioquímicos de laboratorio en ayunas. En la Argentina, la cobertura de screening exhibe una marcada disparidad territorial (Figura 5b): se constata una correlación lineal negativa de gran magnitud a nivel macroecológico entre la pobreza estructural (NBI) y la realización de controles de glucemia alguna vez en la vida (r = -0,74; p &lt; 0,001). Mientras en CABA y Santa Fe más del 89-92% de los adultos refiere haberse testeado, en provincias del NEA y NOA (Chaco 60,3%, Formosa 61,1%, Santiago del Estero 60,6%) aproximadamente cuatro de cada diez adultos refieren no haberse realizado jamás un control glucémico en su vida [3]. Dado que las encuestas poblacionales computan casos conocidos por autorreporte, esta brecha de pesquisa sustenta la hipótesis explicativa del subdiagnóstico: la menor detección en jurisdicciones vulnerables tiende a atenuar artificialmente la prevalencia declarada, impidiendo que emerja el gradiente socioeconómico positivo. Conviene subrayar que este indicador ecológico opera como un estimador proxy del acceso diferencial al sistema sanitario y no como una prueba causal directa ni una cuantificación unívoca del subreporte, cuya estimación numérica rigurosa requerirá la contrastación con las submuestras bioquímicas de laboratorio de la ENFR (Cuadros 7.9–7.11).</w:t>
+        <w:t>1. Hipótesis del subdiagnóstico, correlación entre screening y prevalencia, y el rol de CABA: En la Argentina, el acceso al tamizaje glucémico presenta una fuerte autocorrelación espacial (I de Moran = +0.37; p = 0.023) y una intensa asociación lineal inversa con la pobreza estructural NBI: r = -0.81 (p &lt; 0,001; IC95% [-0.91; -0.60]; Spearman ρ = -0.78; Figura 5b). Mientras en CABA (92,9%) y Santa Fe (89,3%) nueve de cada diez adultos han sido pesquisados, en Chaco (60,3%), Santiago del Estero (60,6%) y Formosa (61,1%) cerca del 40% de los adultos jamás se midió la glucemia [13]. Ahora bien, al evaluar directamente el segundo eslabón —la correlación entre screening y prevalencia declarada— sobre las 24 jurisdicciones completas se obtiene r = +0.13 (p = 0.55; IC95% [-0.29; +0.51]). La razón por la cual esta correlación resulta atenuada es la presencia de CABA como outlier demográfico y epidemiológico: CABA combina el mayor screening del país (92,9%) con la menor prevalencia (8,8%), pero ello obedece a que posee simultáneamente la menor tasa de obesidad nacional (17,0% frente a 26,7% de media provincial), baja inactividad física (32,4%) y mínima pobreza (12,6%). Al realizar el análisis de sensibilidad excluyendo a CABA (N=23 provincias), la correlación entre screening y prevalencia declarada asciende a r = +0.40 (p = 0.057; IC95% [-0.01; +0.70]; Spearman ρ = +0.35): en el interior del país, las jurisdicciones que más testean tienden a detectar mayor prevalencia, mientras que provincias como Jujuy (31,1% de obesidad pero solo 71,3% de screening y 8,9% de diabetes declarada) o Chaco (60,3% de screening y 10,3% de diabetes) sugieren una subcaptación por falta de pesquisa.</w:t>
       </w:r>
     </w:p>
     <w:p>
@@ -2588,7 +2670,7 @@
           <w:i w:val="0"/>
           <w:sz w:val="20"/>
         </w:rPr>
-        <w:t>2. El rol amortiguador del subsistema público en el tratamiento: La ENFR computa la proporción de personas bajo tratamiento farmacológico entre aquellas que ya han sido diagnosticadas (Figura 4a). Una vez que el paciente argentino ingresa al circuito formal de atención, las políticas públicas de provisión gratuita de hipoglucemiantes orales e insulina —en el marco de la Ley Nacional de Diabetes N.º 26.914 y el Programa Remediar [27]— constituyen un factor amortiguador clave frente a la barrera económica. Este mecanismo es coherente con el hecho de que distritos con más del 50% de población sin seguro médico formal (Formosa 62,6%, Chaco 54,2%, Corrientes 44,2%) registren coberturas terapéuticas declaradas sustancialmente más elevadas que distritos con menor vulnerabilidad estructural como La Pampa (32,7%) o Chubut (38,3%).</w:t>
+        <w:t>2. Explicaciones concurrentes (estructura etaria y error muestral): Los datos agregados no permiten afirmar que el subdiagnóstico sea el único causante de la distribución provincial. En primer lugar, las prevalencias del Cuadro 7.3 de la ENFR no se encuentran estandarizadas por edad; dado que las provincias del NEA y NOA poseen pirámides poblacionales más jóvenes que las jurisdicciones pampeanas y cuyanas [12], la menor edad media atenúa genuinamente la prevalencia bruta en el norte. En segundo lugar, el error muestral de la encuesta (con CV de hasta 12,5% en Santiago del Estero y 12,3% en La Rioja) introduce intervalos de incertidumbre que solapan parte de las diferencias interprovinciales.</w:t>
       </w:r>
     </w:p>
     <w:p>
@@ -2604,7 +2686,7 @@
           <w:i w:val="0"/>
           <w:sz w:val="20"/>
         </w:rPr>
-        <w:t>En los Estados Unidos rige la dinámica inversa (Figura 4b): la pesquisa clínica preventiva rutinaria alcanza coberturas muy elevadas (&gt;85% según microdatos del CDC BRFSS [6], [13]), pero el aseguramiento fragmentado impone barreras de copago y precio farmacológico (donde estudios de la ADA y la literatura especializada reportan costos mensuales que han superado históricamente los USD 300 por mes por paciente, propiciando el racionamiento involuntario de medicación [5], [26]).</w:t>
+        <w:t>3. Cobertura vs. brecha de tratamiento farmacológico y rol del subsistema público: Entre las personas diagnosticadas, la cobertura media provincial de tratamiento farmacológico activo en la Argentina es del 53.9% (equivalente a una brecha media sin tratamiento farmacológico del 46.1%, con rango de cobertura entre 32,7% en La Pampa y 70,0% en Santa Cruz y Tierra del Fuego; Figura 4a). A diferencia de los Estados Unidos —donde la barrera económica de costo médico correlaciona positivamente con la carga de enfermedad (r = +0.66; p &lt; 0,001; Figura 4b) y propicia el racionamiento de insulina documentado en encuestas nacionales recientes [9], [10]—, en la Argentina no se observa una correlación regresiva entre el porcentaje de población sin obra social ni prepaga y la cobertura de tratamiento farmacológico: r = -0.11 (p = 0.62; IC95% [-0.49; +0.31]; Spearman ρ = +0.01). En efecto, las tres jurisdicciones del país que superan el 50% de población dependiente exclusivamente del hospital público —Santiago del Estero (56,0% sin cobertura formal), Formosa (55,9%) y Chaco (52,2%)— alcanzan tasas de tratamiento activo del 59,7%, 62,6% y 54,2% respectivamente, superando el promedio nacional. Por su parte, las máximas coberturas patagónicas (Santa Cruz y Tierra del Fuego, ambas con 70,0%) responden a una combinación de alta cobertura de seguridad social formal (solo 17,0% y 15,3% sin cobertura en el Censo 2022 [12]) y redes hospitalarias públicas provinciales, mientras que distritos pampeanos o patagónicos extensos con menor pobreza como La Pampa (32,7% de tratamiento y 32,1% sin cobertura) o Chubut (38,3% de tratamiento y 27,8% sin cobertura) evidencian importantes brechas de adherencia vinculadas a dispersión territorial y seguimiento clínico [17]. Esta evidencia sugiere que la provisión estatal de metformina y glibenclamida en atención primaria a través del Programa Remediar y la cobertura legal del 100% de insulinas e insumos dispuesta por la Ley N.º 26.914 (PRODIABA) [15] amortiguan la desigualdad socioeconómica entre quienes logran ser diagnosticados, si bien persiste un desafío sanitario sustantivo para cubrir el 46.1% promedio de pacientes diagnosticados sin tratamiento farmacológico continuo.</w:t>
       </w:r>
     </w:p>
     <w:p>
@@ -2627,7 +2709,7 @@
       <w:r>
         <w:drawing>
           <wp:inline xmlns:a="http://schemas.openxmlformats.org/drawingml/2006/main" xmlns:pic="http://schemas.openxmlformats.org/drawingml/2006/picture">
-            <wp:extent cx="5940000" cy="2713122"/>
+            <wp:extent cx="5940000" cy="2631045"/>
             <wp:docPr id="5" name="Picture 5"/>
             <wp:cNvGraphicFramePr>
               <a:graphicFrameLocks noChangeAspect="1"/>
@@ -2648,7 +2730,7 @@
                   <pic:spPr>
                     <a:xfrm>
                       <a:off x="0" y="0"/>
-                      <a:ext cx="5940000" cy="2713122"/>
+                      <a:ext cx="5940000" cy="2631045"/>
                     </a:xfrm>
                     <a:prstGeom prst="rect"/>
                   </pic:spPr>
@@ -2671,7 +2753,7 @@
           <w:i w:val="0"/>
           <w:sz w:val="18"/>
         </w:rPr>
-        <w:t>Figura 5. Diagnóstico de escala y mecanismos explicativos: (a) Contraste de regresión lineal Pobreza vs. Prevalencia; (b) Argentina: Correlación inversa entre Pobreza Estructural (NBI) y Acceso a Screening (r = -0,74; p &lt; 0,001), evidenciando el sesgo de subdiagnóstico.</w:t>
+        <w:t>Figura 5. Diagnóstico de determinantes y tamizaje: (a) Regresión lineal Privación monetaria vs. Prevalencia con IC95%; (b) Argentina: Correlación inversa entre NBI y Screening (r = -0.81; p &lt; 0,001).</w:t>
       </w:r>
     </w:p>
     <w:p>
@@ -2686,7 +2768,7 @@
           <w:i w:val="0"/>
           <w:sz w:val="18"/>
         </w:rPr>
-        <w:t>Tabla 3. Diagnóstico comparativo de rendimiento in-sample y generalización fuera de muestra (Validation Cross-Validation y LOOCV) frente al estimador naive baseline.</w:t>
+        <w:t>Tabla 3. Evaluación comparativa simétrica in-sample y fuera de muestra (LOOCV y 5-Fold CV) de modelos multivariados, regularizados (Ridge), parsimoniosos (1 predictor) y no lineales (Random Forest).</w:t>
       </w:r>
     </w:p>
     <w:tbl>
@@ -2728,7 +2810,7 @@
                 <w:i w:val="0"/>
                 <w:sz w:val="17"/>
               </w:rPr>
-              <w:t>Modelo y Algoritmo</w:t>
+              <w:t>Modelo y Esquema de Evaluación</w:t>
             </w:r>
           </w:p>
         </w:tc>
@@ -2748,7 +2830,7 @@
                 <w:i w:val="0"/>
                 <w:sz w:val="17"/>
               </w:rPr>
-              <w:t>EE.UU. R² (Ajustado)</w:t>
+              <w:t>EE.UU. R²</w:t>
             </w:r>
           </w:p>
         </w:tc>
@@ -2768,7 +2850,7 @@
                 <w:i w:val="0"/>
                 <w:sz w:val="17"/>
               </w:rPr>
-              <w:t>EE.UU. Error MAE</w:t>
+              <w:t>EE.UU. MAE</w:t>
             </w:r>
           </w:p>
         </w:tc>
@@ -2788,7 +2870,7 @@
                 <w:i w:val="0"/>
                 <w:sz w:val="17"/>
               </w:rPr>
-              <w:t>Argentina R² (Ajustado)</w:t>
+              <w:t>Argentina R²</w:t>
             </w:r>
           </w:p>
         </w:tc>
@@ -2808,7 +2890,7 @@
                 <w:i w:val="0"/>
                 <w:sz w:val="17"/>
               </w:rPr>
-              <w:t>Argentina Error MAE</w:t>
+              <w:t>Argentina MAE</w:t>
             </w:r>
           </w:p>
         </w:tc>
@@ -2950,7 +3032,7 @@
                 <w:i w:val="0"/>
                 <w:sz w:val="17"/>
               </w:rPr>
-              <w:t>Referencia base (R²=0): dispersión intrínseca sin covariables (Var=4,24)</w:t>
+              <w:t>Referencia base (R²=0): dispersión intrínseca Var(y)=4.24 (DE=2.06%)</w:t>
             </w:r>
           </w:p>
         </w:tc>
@@ -2972,7 +3054,7 @@
                 <w:i w:val="0"/>
                 <w:sz w:val="17"/>
               </w:rPr>
-              <w:t>OLS Multivariado (Muestra completa)</w:t>
+              <w:t>OLS Multivariado 5 vars (In-Sample, muestra completa)</w:t>
             </w:r>
           </w:p>
         </w:tc>
@@ -2992,7 +3074,7 @@
                 <w:i w:val="0"/>
                 <w:sz w:val="17"/>
               </w:rPr>
-              <w:t>0.891 (0.878)</w:t>
+              <w:t>0.891 (adj 0.878)</w:t>
             </w:r>
           </w:p>
         </w:tc>
@@ -3032,7 +3114,7 @@
                 <w:i w:val="0"/>
                 <w:sz w:val="17"/>
               </w:rPr>
-              <w:t>0.264 (0.059)</w:t>
+              <w:t>0.264 (adj 0.059)</w:t>
             </w:r>
           </w:p>
         </w:tc>
@@ -3072,7 +3154,7 @@
                 <w:i w:val="0"/>
                 <w:sz w:val="17"/>
               </w:rPr>
-              <w:t>EE.UU. altamente significativo (p&lt;0.001); Argentina no significativo (p=0.31)</w:t>
+              <w:t>EE.UU. significativo (F=73.3, p&lt;0.001); Arg no significativo (F=1.29, p=0.31)</w:t>
             </w:r>
           </w:p>
         </w:tc>
@@ -3094,7 +3176,7 @@
                 <w:i w:val="0"/>
                 <w:sz w:val="17"/>
               </w:rPr>
-              <w:t>Validación Cruzada OLS (LOOCV en Arg, 5-Fold en US)</w:t>
+              <w:t>OLS Multivariado 5 vars (LOOCV / 5-Fold CV)</w:t>
             </w:r>
           </w:p>
         </w:tc>
@@ -3114,7 +3196,7 @@
                 <w:i w:val="0"/>
                 <w:sz w:val="17"/>
               </w:rPr>
-              <w:t>0.842</w:t>
+              <w:t>0.859 / 0.842</w:t>
             </w:r>
           </w:p>
         </w:tc>
@@ -3134,7 +3216,7 @@
                 <w:i w:val="0"/>
                 <w:sz w:val="17"/>
               </w:rPr>
-              <w:t>0.59%</w:t>
+              <w:t>0.56% / 0.59%</w:t>
             </w:r>
           </w:p>
         </w:tc>
@@ -3154,7 +3236,7 @@
                 <w:i w:val="0"/>
                 <w:sz w:val="17"/>
               </w:rPr>
-              <w:t>-0.701</w:t>
+              <w:t>-0.701 / -1.294</w:t>
             </w:r>
           </w:p>
         </w:tc>
@@ -3174,7 +3256,7 @@
                 <w:i w:val="0"/>
                 <w:sz w:val="17"/>
               </w:rPr>
-              <w:t>2.12%</w:t>
+              <w:t>2.12% / 2.43%</w:t>
             </w:r>
           </w:p>
         </w:tc>
@@ -3194,7 +3276,7 @@
                 <w:i w:val="0"/>
                 <w:sz w:val="17"/>
               </w:rPr>
-              <w:t>Marcada degradación predictiva en Arg (R² &lt; 0): el error supera al estimador baseline</w:t>
+              <w:t>Sobreajuste severo en Arg (MSE LOOCV=7.21 &gt; Var(y)=4.24)</w:t>
             </w:r>
           </w:p>
         </w:tc>
@@ -3216,7 +3298,7 @@
                 <w:i w:val="0"/>
                 <w:sz w:val="17"/>
               </w:rPr>
-              <w:t>Random Forest Regressor (5-Fold CV)</w:t>
+              <w:t>Regresión Regularizada Ridge α=10 (LOOCV / 5-Fold CV)</w:t>
             </w:r>
           </w:p>
         </w:tc>
@@ -3236,7 +3318,7 @@
                 <w:i w:val="0"/>
                 <w:sz w:val="17"/>
               </w:rPr>
-              <w:t>0.802</w:t>
+              <w:t>0.858 / 0.856</w:t>
             </w:r>
           </w:p>
         </w:tc>
@@ -3256,7 +3338,7 @@
                 <w:i w:val="0"/>
                 <w:sz w:val="17"/>
               </w:rPr>
-              <w:t>0.66%</w:t>
+              <w:t>0.58% / 0.58%</w:t>
             </w:r>
           </w:p>
         </w:tc>
@@ -3276,7 +3358,7 @@
                 <w:i w:val="0"/>
                 <w:sz w:val="17"/>
               </w:rPr>
-              <w:t>-0.802</w:t>
+              <w:t>-0.311 / -0.429</w:t>
             </w:r>
           </w:p>
         </w:tc>
@@ -3296,7 +3378,7 @@
                 <w:i w:val="0"/>
                 <w:sz w:val="17"/>
               </w:rPr>
-              <w:t>2.20%</w:t>
+              <w:t>1.87% / 1.97%</w:t>
             </w:r>
           </w:p>
         </w:tc>
@@ -3316,7 +3398,251 @@
                 <w:i w:val="0"/>
                 <w:sz w:val="17"/>
               </w:rPr>
-              <w:t>Sólido ajuste en EE.UU.; en Arg falla por distorsión de subdiagnóstico y reducido N=24</w:t>
+              <w:t>La penalización L2 atenúa la varianza en Arg pero mantiene R²_CV &lt; 0</w:t>
+            </w:r>
+          </w:p>
+        </w:tc>
+      </w:tr>
+      <w:tr>
+        <w:tc>
+          <w:tcPr>
+            <w:tcW w:type="dxa" w:w="1606"/>
+          </w:tcPr>
+          <w:p>
+            <w:pPr>
+              <w:spacing w:after="30" w:before="30"/>
+              <w:jc w:val="left"/>
+            </w:pPr>
+            <w:r>
+              <w:rPr>
+                <w:rFonts w:ascii="Times New Roman" w:hAnsi="Times New Roman" w:eastAsia="Times New Roman"/>
+                <w:b w:val="0"/>
+                <w:i w:val="0"/>
+                <w:sz w:val="17"/>
+              </w:rPr>
+              <w:t>OLS Parsimonioso 1 predictor: Obesidad (LOOCV / 5-Fold)</w:t>
+            </w:r>
+          </w:p>
+        </w:tc>
+        <w:tc>
+          <w:tcPr>
+            <w:tcW w:type="dxa" w:w="1606"/>
+          </w:tcPr>
+          <w:p>
+            <w:pPr>
+              <w:spacing w:after="30" w:before="30"/>
+              <w:jc w:val="center"/>
+            </w:pPr>
+            <w:r>
+              <w:rPr>
+                <w:rFonts w:ascii="Times New Roman" w:hAnsi="Times New Roman" w:eastAsia="Times New Roman"/>
+                <w:b w:val="0"/>
+                <w:i w:val="0"/>
+                <w:sz w:val="17"/>
+              </w:rPr>
+              <w:t>0.532 / 0.521</w:t>
+            </w:r>
+          </w:p>
+        </w:tc>
+        <w:tc>
+          <w:tcPr>
+            <w:tcW w:type="dxa" w:w="1606"/>
+          </w:tcPr>
+          <w:p>
+            <w:pPr>
+              <w:spacing w:after="30" w:before="30"/>
+              <w:jc w:val="center"/>
+            </w:pPr>
+            <w:r>
+              <w:rPr>
+                <w:rFonts w:ascii="Times New Roman" w:hAnsi="Times New Roman" w:eastAsia="Times New Roman"/>
+                <w:b w:val="0"/>
+                <w:i w:val="0"/>
+                <w:sz w:val="17"/>
+              </w:rPr>
+              <w:t>1.02% / 1.03%</w:t>
+            </w:r>
+          </w:p>
+        </w:tc>
+        <w:tc>
+          <w:tcPr>
+            <w:tcW w:type="dxa" w:w="1606"/>
+          </w:tcPr>
+          <w:p>
+            <w:pPr>
+              <w:spacing w:after="30" w:before="30"/>
+              <w:jc w:val="center"/>
+            </w:pPr>
+            <w:r>
+              <w:rPr>
+                <w:rFonts w:ascii="Times New Roman" w:hAnsi="Times New Roman" w:eastAsia="Times New Roman"/>
+                <w:b w:val="0"/>
+                <w:i w:val="0"/>
+                <w:sz w:val="17"/>
+              </w:rPr>
+              <w:t>-0.100 / -0.023</w:t>
+            </w:r>
+          </w:p>
+        </w:tc>
+        <w:tc>
+          <w:tcPr>
+            <w:tcW w:type="dxa" w:w="1606"/>
+          </w:tcPr>
+          <w:p>
+            <w:pPr>
+              <w:spacing w:after="30" w:before="30"/>
+              <w:jc w:val="center"/>
+            </w:pPr>
+            <w:r>
+              <w:rPr>
+                <w:rFonts w:ascii="Times New Roman" w:hAnsi="Times New Roman" w:eastAsia="Times New Roman"/>
+                <w:b w:val="0"/>
+                <w:i w:val="0"/>
+                <w:sz w:val="17"/>
+              </w:rPr>
+              <w:t>1.58% / 1.56%</w:t>
+            </w:r>
+          </w:p>
+        </w:tc>
+        <w:tc>
+          <w:tcPr>
+            <w:tcW w:type="dxa" w:w="1606"/>
+          </w:tcPr>
+          <w:p>
+            <w:pPr>
+              <w:spacing w:after="30" w:before="30"/>
+              <w:jc w:val="center"/>
+            </w:pPr>
+            <w:r>
+              <w:rPr>
+                <w:rFonts w:ascii="Times New Roman" w:hAnsi="Times New Roman" w:eastAsia="Times New Roman"/>
+                <w:b w:val="0"/>
+                <w:i w:val="0"/>
+                <w:sz w:val="17"/>
+              </w:rPr>
+              <w:t>Incluso con 1 solo predictor sin sobreparametrización no hay señal en Arg (R²&lt;0)</w:t>
+            </w:r>
+          </w:p>
+        </w:tc>
+      </w:tr>
+      <w:tr>
+        <w:tc>
+          <w:tcPr>
+            <w:tcW w:type="dxa" w:w="1606"/>
+          </w:tcPr>
+          <w:p>
+            <w:pPr>
+              <w:spacing w:after="30" w:before="30"/>
+              <w:jc w:val="left"/>
+            </w:pPr>
+            <w:r>
+              <w:rPr>
+                <w:rFonts w:ascii="Times New Roman" w:hAnsi="Times New Roman" w:eastAsia="Times New Roman"/>
+                <w:b w:val="0"/>
+                <w:i w:val="0"/>
+                <w:sz w:val="17"/>
+              </w:rPr>
+              <w:t>Random Forest Regressor (LOOCV / 5-Fold CV)</w:t>
+            </w:r>
+          </w:p>
+        </w:tc>
+        <w:tc>
+          <w:tcPr>
+            <w:tcW w:type="dxa" w:w="1606"/>
+          </w:tcPr>
+          <w:p>
+            <w:pPr>
+              <w:spacing w:after="30" w:before="30"/>
+              <w:jc w:val="center"/>
+            </w:pPr>
+            <w:r>
+              <w:rPr>
+                <w:rFonts w:ascii="Times New Roman" w:hAnsi="Times New Roman" w:eastAsia="Times New Roman"/>
+                <w:b w:val="0"/>
+                <w:i w:val="0"/>
+                <w:sz w:val="17"/>
+              </w:rPr>
+              <w:t>0.815 / 0.802</w:t>
+            </w:r>
+          </w:p>
+        </w:tc>
+        <w:tc>
+          <w:tcPr>
+            <w:tcW w:type="dxa" w:w="1606"/>
+          </w:tcPr>
+          <w:p>
+            <w:pPr>
+              <w:spacing w:after="30" w:before="30"/>
+              <w:jc w:val="center"/>
+            </w:pPr>
+            <w:r>
+              <w:rPr>
+                <w:rFonts w:ascii="Times New Roman" w:hAnsi="Times New Roman" w:eastAsia="Times New Roman"/>
+                <w:b w:val="0"/>
+                <w:i w:val="0"/>
+                <w:sz w:val="17"/>
+              </w:rPr>
+              <w:t>0.67% / 0.66%</w:t>
+            </w:r>
+          </w:p>
+        </w:tc>
+        <w:tc>
+          <w:tcPr>
+            <w:tcW w:type="dxa" w:w="1606"/>
+          </w:tcPr>
+          <w:p>
+            <w:pPr>
+              <w:spacing w:after="30" w:before="30"/>
+              <w:jc w:val="center"/>
+            </w:pPr>
+            <w:r>
+              <w:rPr>
+                <w:rFonts w:ascii="Times New Roman" w:hAnsi="Times New Roman" w:eastAsia="Times New Roman"/>
+                <w:b w:val="0"/>
+                <w:i w:val="0"/>
+                <w:sz w:val="17"/>
+              </w:rPr>
+              <w:t>-0.657 / -0.802</w:t>
+            </w:r>
+          </w:p>
+        </w:tc>
+        <w:tc>
+          <w:tcPr>
+            <w:tcW w:type="dxa" w:w="1606"/>
+          </w:tcPr>
+          <w:p>
+            <w:pPr>
+              <w:spacing w:after="30" w:before="30"/>
+              <w:jc w:val="center"/>
+            </w:pPr>
+            <w:r>
+              <w:rPr>
+                <w:rFonts w:ascii="Times New Roman" w:hAnsi="Times New Roman" w:eastAsia="Times New Roman"/>
+                <w:b w:val="0"/>
+                <w:i w:val="0"/>
+                <w:sz w:val="17"/>
+              </w:rPr>
+              <w:t>2.07% / 2.20%</w:t>
+            </w:r>
+          </w:p>
+        </w:tc>
+        <w:tc>
+          <w:tcPr>
+            <w:tcW w:type="dxa" w:w="1606"/>
+          </w:tcPr>
+          <w:p>
+            <w:pPr>
+              <w:spacing w:after="30" w:before="30"/>
+              <w:jc w:val="center"/>
+            </w:pPr>
+            <w:r>
+              <w:rPr>
+                <w:rFonts w:ascii="Times New Roman" w:hAnsi="Times New Roman" w:eastAsia="Times New Roman"/>
+                <w:b w:val="0"/>
+                <w:i w:val="0"/>
+                <w:sz w:val="17"/>
+              </w:rPr>
+              <w:t>Sólida generalización en EE.UU.; fallo fuera de muestra en Arg en ambos esquemas</w:t>
             </w:r>
           </w:p>
         </w:tc>
@@ -3339,7 +3665,7 @@
           <w:i w:val="0"/>
           <w:sz w:val="18"/>
         </w:rPr>
-        <w:t>Tabla 4. Ranking de casos extremos: Jurisdicciones de mayor y menor prevalencia relativa en Estados Unidos y la República Argentina.</w:t>
+        <w:t>Tabla 4. Ranking de jurisdicciones extremas en prevalencia de diabetes en Estados Unidos y la República Argentina.</w:t>
       </w:r>
     </w:p>
     <w:tbl>
@@ -3440,7 +3766,7 @@
                 <w:i w:val="0"/>
                 <w:sz w:val="17"/>
               </w:rPr>
-              <w:t>Pobreza (%)</w:t>
+              <w:t>Ingresos &lt;USD 25k (US) / Pobreza EPH (Arg)</w:t>
             </w:r>
           </w:p>
         </w:tc>
@@ -3562,7 +3888,7 @@
                 <w:i w:val="0"/>
                 <w:sz w:val="17"/>
               </w:rPr>
-              <w:t>Cinturón de Diabetes (Sur)</w:t>
+              <w:t>Cinturón de Diabetes (Sur profundo)</w:t>
             </w:r>
           </w:p>
         </w:tc>
@@ -3664,7 +3990,7 @@
                 <w:i w:val="0"/>
                 <w:sz w:val="17"/>
               </w:rPr>
-              <w:t>Alta inactividad (31,9%)</w:t>
+              <w:t>Apalaches; inactividad 30.8%</w:t>
             </w:r>
           </w:p>
         </w:tc>
@@ -3766,7 +4092,7 @@
                 <w:i w:val="0"/>
                 <w:sz w:val="17"/>
               </w:rPr>
-              <w:t>Elevado ingreso y actividad</w:t>
+              <w:t>Mayor ingreso relativo y actividad física</w:t>
             </w:r>
           </w:p>
         </w:tc>
@@ -3868,7 +4194,7 @@
                 <w:i w:val="0"/>
                 <w:sz w:val="17"/>
               </w:rPr>
-              <w:t>Baja obesidad (25,4%)</w:t>
+              <w:t>Baja prevalencia de obesidad y tabaquismo</w:t>
             </w:r>
           </w:p>
         </w:tc>
@@ -3970,7 +4296,7 @@
                 <w:i w:val="0"/>
                 <w:sz w:val="17"/>
               </w:rPr>
-              <w:t>Región Cuyo (máx. nacional)</w:t>
+              <w:t>Región Cuyo (máximo nacional ENFR 2018)</w:t>
             </w:r>
           </w:p>
         </w:tc>
@@ -4072,7 +4398,7 @@
                 <w:i w:val="0"/>
                 <w:sz w:val="17"/>
               </w:rPr>
-              <w:t>Tratamiento activo 58,1%</w:t>
+              <w:t>Máxima obesidad nacional (34.4%)</w:t>
             </w:r>
           </w:p>
         </w:tc>
@@ -4174,7 +4500,7 @@
                 <w:i w:val="0"/>
                 <w:sz w:val="17"/>
               </w:rPr>
-              <w:t>Screening 92,9% (CABA)</w:t>
+              <w:t>Menor obesidad (17,0%) y máx. screening (92.9%)</w:t>
             </w:r>
           </w:p>
         </w:tc>
@@ -4276,7 +4602,7 @@
                 <w:i w:val="0"/>
                 <w:sz w:val="17"/>
               </w:rPr>
-              <w:t>Subdiagnóstico: screening 60%</w:t>
+              <w:t>Obesidad 31,1% pero bajo screening (71.3%)</w:t>
             </w:r>
           </w:p>
         </w:tc>
@@ -4312,7 +4638,7 @@
           <w:i w:val="0"/>
           <w:sz w:val="22"/>
         </w:rPr>
-        <w:t>4.5. Evaluación metodológica y límites de predictibilidad</w:t>
+        <w:t>4.5. Evaluación predictiva simétrica y modelos parsimoniosos/regularizados</w:t>
       </w:r>
     </w:p>
     <w:p>
@@ -4328,7 +4654,7 @@
           <w:i w:val="0"/>
           <w:sz w:val="20"/>
         </w:rPr>
-        <w:t>El contraste entre algoritmos lineales y no lineales frente a un modelo de referencia ingenuo o naive baseline (Tabla 3) aporta una demostración cuantitativa rigurosa sobre los límites del modelado predictivo en epidemiología espacial. En los Estados Unidos (N=51), el gradiente socioeconómico homogéneo permite que tanto la regresión lineal múltiple OLS (R² = 0,891, R²_adj = 0,878) como el ensamble no lineal de Random Forest (R²_CV = 0,802) alcancen un sólido desempeño fuera de muestra, reduciendo drásticamente el error absoluto medio desde el valor base de 1,53% a 0,50% in-sample y 0,59% en validación cruzada 5-fold. La variabilidad inter-fold en EE.UU. resulta sumamente reducida (MAE = 0,59% ± 0,04%; R² = 0,77 ± 0,10), certificando la estabilidad estructural de la señal predictiva a lo largo de las divisiones geográficas norteamericanas.</w:t>
+        <w:t>La Tabla 3 presenta la evaluación simétrica de los algoritmos supervisados mediante LOOCV y 5-Fold CV en ambos países frente al estimador naive baseline. En los Estados Unidos (N=51), la intensa señal lineal permite que tanto el modelo OLS multivariado (R² in-sample = 0.891; LOOCV R² = 0.859; 5-Fold R² = 0.842) como la regresión regularizada Ridge (LOOCV R² = 0.858; 5-Fold R² = 0.856) y el ensamble de Random Forest [20], [24] (LOOCV R² = 0.815; 5-Fold R² = 0.802) reduzcan el error absoluto medio desde el baseline de 1.53% a un rango de 0,56%–0,67% fuera de muestra. Incluso una especificación parsimoniosa univariada con un solo predictor (obesidad) retiene más del 52% de varianza explicada fuera de muestra (LOOCV R² = 0.532).</w:t>
       </w:r>
     </w:p>
     <w:p>
@@ -4344,7 +4670,7 @@
           <w:i w:val="0"/>
           <w:sz w:val="20"/>
         </w:rPr>
-        <w:t>Por el contrario, al replicar la modelización sobre las 24 provincias argentinas, se evidencia por qué el modelado predictivo fracasa fuera de muestra frente al estimador de referencia. Un predictor ingenuo que asigne sistemáticamente la media constante provincial (ȳ = 13,0%) obtiene, por definición, R² = 0, con una desviación absoluta media de MAE_baseline = 1,59% y una varianza no explicada de MSE_baseline = Var(y) = 4,24. Si bien el modelo OLS in-sample aparenta un ajuste modesto (R² = 0,264, R²_adj = 0,059, MAE = 1,44%), al someterlo a validación cruzada exhaustiva Leave-One-Out (LOOCV, determinística sobre los 24 pliegues jurisdiccionales), el error absoluto medio asciende a MAE = 2,12% y el error cuadrático medio escala a MSE_LOOCV = 7,21. Dado que la métrica formal de evaluación fuera de muestra es R²_CV = 1 - (MSE_modelo / MSE_baseline), y el error cuadrático del modelo supera a la varianza de los datos en un 70,1% (7,21 / 4,24 = 1,701), el coeficiente resultante se torna estrictamente negativo (R²_LOOCV = -0,701). Idéntica degradación exhibe el ensamble no lineal de Random Forest (R²_CV = -0,802; MAE = 2,20%).</w:t>
+        <w:t>Por el contrario, en las 24 jurisdicciones argentinas, el predictor ingenuo de media constante (ȳ = 13.0%) establece un umbral base de R² = 0,000 con MAE = 1.59% y MSE_baseline = Var(y) = 4.24. Al evaluar el modelo OLS de 5 predictores fuera de muestra, el MSE en LOOCV asciende a 7.21 (MAE = 2.12%), superando en un 70,1% a la varianza intrínseca de la serie (7.21 / 4.24 = 1,701) y arrojando R²_LOOCV = -0.701 (y R²_5Fold = -1.294). De igual modo, Random Forest obtiene R²_LOOCV = -0.657 y R²_5Fold = -0.802.</w:t>
       </w:r>
     </w:p>
     <w:p>
@@ -4360,7 +4686,7 @@
           <w:i w:val="0"/>
           <w:sz w:val="20"/>
         </w:rPr>
-        <w:t>Esta demostración formal prueba que en la Argentina la inclusión de covariables socioeconómicas convencionales a escala agregada no agrega potencia predictiva fuera de muestra, sino que introduce varianza espuria y sobreajuste que degradan el pronóstico respecto a la simple media histórica provincial. Tal fenómeno no es atribuible únicamente a la muestra acotada (N=24), dado que en EE.UU. la agregación interestatal también opera con un tamaño reducido (N=51). La causa sustantiva radica en el desacople estructural producido por el subdiagnóstico territorial: al no medirse la verdadera prevalencia biológica en las provincias de mayor vulnerabilidad sino solo los casos autorreportados, la señal predictiva lineal queda distorsionada. En tales condiciones, forzar algoritmos supervisados de Machine Learning sobre datos agregados reducidos induce a sobreajustes severos. Por ende, la recomendación metodológica concluyente consiste en priorizar atlas geoespaciales descriptivos, auditorías de calidad de dato y operativos proactivos de pesquisa clínica territorial por sobre el solucionismo predictivo algorítmico.</w:t>
+        <w:t>Para verificar si este resultado responde meramente al exceso de parámetros (5 predictores para N=24 observaciones), se evaluaron dos alternativas parsimoniosas (Tabla 3): una regresión Ridge con fuerte penalización L2 (α=10) y un modelo OLS bivariado con un único predictor (obesidad). Si bien la regularización Ridge reduce el sobreajuste respecto al OLS sin penalizar (mejorando el R²_LOOCV de -0.701 a -0.311, con MAE = 1.87%) y el modelo univariado alcanza R²_LOOCV = -0.100 (MAE = 1.58%), absolutamente todas las especificaciones arrojan R² fuera de muestra negativos en ambos esquemas de validación cruzada. Esto evidencia, en línea con las advertencias metodológicas de Varoquaux y Cheplygina [21], que en la agregación provincial argentina la limitación no radica únicamente en la relación parámetros-muestra, sino en la ausencia de señal lineal entre las covariables ecológicas y la prevalencia autorreportada, sugiriendo la conveniencia de evitar el ajuste acrítico de modelos predictivos sobre agregados pequeños con sesgos de medición.</w:t>
       </w:r>
     </w:p>
     <w:p>
@@ -4408,7 +4734,7 @@
           <w:i w:val="0"/>
           <w:sz w:val="20"/>
         </w:rPr>
-        <w:t>Los hallazgos de este estudio sustentan hipótesis interpretativas directas para la gestión sanitaria. Sugieren que las barreras que obstaculizan el control integral de la diabetes operan en puntos opuestos de la cadena asistencial: en los Estados Unidos los datos son consistentes con una barrera preponderante de mercado y cobertura financiera (costos directos y copagos), requiriendo medidas regulatorias de precios tope a la insulina y subsidios a insumos [26]; en la Argentina los patrones observados indican que la barrera crítica es de orden logístico, geográfico y de pesquisa temprana.</w:t>
+        <w:t>Los resultados obtenidos sugieren implicancias diferenciadas para la gestión sanitaria en ambos países. En los Estados Unidos, donde el tamizaje clínico se encuentra generalizado pero la privación socioeconómica y la barrera de costo médico se asocian fuertemente con la carga de la enfermedad [5], [7], las prioridades de política pública se orientan a regular el precio de bolsillo de la insulina y reducir los copagos que inducen al racionamiento terapéutico [9], [10].</w:t>
       </w:r>
     </w:p>
     <w:p>
@@ -4424,7 +4750,7 @@
           <w:i w:val="0"/>
           <w:sz w:val="20"/>
         </w:rPr>
-        <w:t>En el territorio argentino, los programas de distribución gratuita de medicamentos esenciales como Remediar (Ley 26.914) representan un factor explicativo plausible para comprender la elevada adherencia terapéutica observada en pacientes ya diagnosticados del subsistema público [27]. Sin embargo, la efectividad potencial de dicha cobertura farmacológica se ve limitada si aproximadamente cuatro de cada diez adultos en provincias del norte nunca acceden al tamizaje inicial. Por tanto, es prioritario orientar las políticas públicas hacia operativos activos de detección temprana en centros de atención primaria barriales y parajes rurales, superando la detección pasiva hospitalaria.</w:t>
+        <w:t>En la República Argentina, la evidencia ecológica sugiere una doble prioridad territorial: (i) en las provincias del NEA y NOA con elevado NBI, donde cerca del 40% de los adultos nunca accedió a una medición de glucemia [13], resulta prioritario fortalecer operativos de pesquisa activa capilar y bioquímica en el primer nivel de atención conforme a la Guía de Práctica Clínica Nacional [14] para reducir el subdiagnóstico; y (ii) en materia terapéutica, si bien la red pública respaldada por el Programa Remediar (provisión de metformina y glibenclamida en centros de atención primaria) y la Ley N.º 26.914 / PRODIABA (cobertura legal del 100% de insulinas y tiras reactivas) [15] evita que las provincias con mayor proporción de población sin obra social queden rezagadas, la existencia de una brecha nacional promedio del 45,6% de pacientes diagnosticados sin tratamiento farmacológico activo —con valores críticos en provincias extensas como La Pampa (67,3% de brecha) y Chubut (61,7%)— exige auditar la continuidad de seguimiento clínico y el acceso logístico en todo el territorio.</w:t>
       </w:r>
     </w:p>
     <w:p>
@@ -4440,7 +4766,7 @@
           <w:i w:val="0"/>
           <w:sz w:val="22"/>
         </w:rPr>
-        <w:t>5.2. Aportes epistemológicos y limitaciones metodológicas</w:t>
+        <w:t>5.2. Aportes metodológicos y limitaciones del estudio</w:t>
       </w:r>
     </w:p>
     <w:p>
@@ -4456,7 +4782,7 @@
           <w:i w:val="0"/>
           <w:sz w:val="20"/>
         </w:rPr>
-        <w:t>En el ámbito de la informática médica, este estudio intercala una advertencia epistemológica contra el 'solucionismo predictivo'. La disponibilidad de algoritmos avanzados de aprendizaje automático suele inducir a su entrenamiento sobre agregaciones territoriales macro (N=24 provincias o N=51 estados) sin advertir que tales escalas carecen de la granularidad requerida para captar interacciones complejas fuera de muestra. Cuando las tasas observadas se encuentran moduladas por sesgos de acceso al diagnóstico, los algoritmos supervisados confunden el subregistro con una baja carga biológica.</w:t>
+        <w:t>Desde una perspectiva metodológica, este estudio aporta una reflexión empírica alineada con los estándares TRIPOD+AI [22] sobre el uso de modelos supervisados en epidemiología espacial. Cuando el tamaño muestral de unidades geográficas es reducido (N=24) y la variable dependiente autorreportada se encuentra sujeta a sesgos de detección, variabilidad muestral y confusión demográfica, tanto los modelos lineales multiparamétricos como los ensambles de árboles sobreajustan el ruido local y empeoran el pronóstico respecto a la media histórica [21]. En tales escenarios, el valor de la ciencia de datos reside en la construcción de atlas geoespaciales descriptivos, el análisis de autocorrelación espacial y la integración transparente de fuentes oficiales [19].</w:t>
       </w:r>
     </w:p>
     <w:p>
@@ -4472,7 +4798,7 @@
           <w:i w:val="0"/>
           <w:sz w:val="20"/>
         </w:rPr>
-        <w:t>Asimismo, debe subrayarse con cautela metodológica la distinción entre lo observado empíricamente y las hipótesis interpretativas formuladas: la fuerte correlación inversa entre pobreza estructural y controles de glucemia (r = -0,74) aporta una evidencia empírica consistente que respalda la hipótesis del subdiagnóstico territorial en el norte argentino, pero opera como un indicador proxy ecológico y no constituye una prueba causal estricta ni una cuantificación cerrada de casos no detectados. Del mismo modo, la asociación entre vulnerabilidad social y sostenimiento del tratamiento farmacológico se plantea como una hipótesis compatible con la función amortiguadora del subsistema público, la cual deberá ser contrastada con registros individualizados de dispensación clínica. Finalmente, deben reconocerse las limitaciones inherentes al estudio: el desfasaje temporal entre relevamientos (BRFSS 2015, ENFR 2018 y Censos 2010/2022), las divergencias de modalidad entre encuestas telefónicas (CATI) y presenciales de hogares, y el riesgo de incurrir en falacia ecológica si se intentan trasladar estas relaciones macrojurisdiccionales a conductas o riesgos biológicos individuales.</w:t>
+        <w:t>Finalmente, deben sintetizarse con rigor las limitaciones del estudio: (i) el carácter ecológico de las regresiones impide realizar inferencias causales individuales (falacia ecológica) y está condicionado por la delimitación político-administrativa provincial (MAUP) [19]; (ii) la presencia de autocorrelación espacial positiva en la prevalencia (I de Moran = +0,59 en EE.UU. y +0,33 en Argentina) implica que las jurisdicciones vecinas no son estrictamente independientes, lo cual motiva el empleo futuro de modelos autorregresivos espaciales (SAR/SEM) [19]; (iii) las tasas provinciales de la ENFR carecen de estandarización por edad y presentan errores muestrales (CV de hasta 12,5%) e intervalos de confianza amplios por el tamaño muestral (N=24); (iv) existen diferencias operativas en los instrumentos de medición entre ambas encuestas (inclusión de 'glucemia elevada' y cuestionario IPAQ en la ENFR frente a diagnóstico estricto e inactividad recreativa en el BRFSS) y desfasajes temporales entre cortes censales y encuestas; y (v) la asociación entre NBI, screening y prevalencia constituye una evidencia ecológica compatible con el subdiagnóstico, pero su cuantificación definitiva requiere analizar mediciones bioquímicas directas.</w:t>
       </w:r>
     </w:p>
     <w:p>
@@ -4504,7 +4830,7 @@
           <w:i w:val="0"/>
           <w:sz w:val="20"/>
         </w:rPr>
-        <w:t>Se implementó un pipeline reproducible de ciencia de datos que comparó los determinantes territoriales de la diabetes mellitus entre los Estados Unidos y la República Argentina. Los hallazgos sugieren que mientras en EE.UU. la privación socioeconómica exhibe una fuerte correlación lineal con la prevalencia observada (r = +0,81; R² = 0,891), en la Argentina la menor cobertura de screening en regiones con alta pobreza estructural (r = -0,74 entre NBI y tamizaje) sustenta la hipótesis de subdiagnóstico como factor de distorsión de la prevalencia declarada, mientras que el subsistema público amortigua la brecha farmacológica entre los diagnosticados.</w:t>
+        <w:t>Se desarrolló un pipeline reproducible de ciencia de datos que contrastó los determinantes territoriales de la diabetes mellitus entre los Estados Unidos (N=51) y la República Argentina (N=24). Los resultados sugieren que mientras en los Estados Unidos la prevalencia sigue un marcado agrupamiento espacial (I de Moran = +0.59) y un gradiente socioeconómico lineal (r = +0.81 con bajos ingresos; R² OLS = 0.891), en la Argentina la prevalencia declarada no correlaciona linealmente con la pobreza monetaria (r = -0.05; IC95% [-0.44; +0.36]). El análisis territorial sugiere que este comportamiento responde a la conjunción de factores demográficos y muestrales con un severo déficit de tamizaje en las provincias de mayor NBI (r = -0.81 entre NBI y screening; y r = +0.40 entre screening y diabetes al excluir el outlier de CABA), mientras que el subsistema público atenúa la regresividad en el acceso a fármacos entre los diagnosticados (r = -0.11), aun cuando persiste una brecha nacional del 46.1% sin tratamiento activo.</w:t>
       </w:r>
     </w:p>
     <w:p>
@@ -4520,7 +4846,7 @@
           <w:i w:val="0"/>
           <w:sz w:val="20"/>
         </w:rPr>
-        <w:t>Asimismo, se demostró cuantitativamente que los modelos supervisados de Machine Learning aplicados a nivel provincial (N=24) experimentan una sustancial pérdida de capacidad predictiva fuera de muestra frente al estimador baseline ingenuo (LOOCV R² = -0,701; Random Forest R² = -0,802; MAE = 2,12% vs. baseline 1,59%), fundamentando el valor del atlas geoespacial y el análisis descriptivo riguroso como enfoques prioritarios en salud pública.</w:t>
+        <w:t>En el plano computacional, la evaluación cruzada simétrica evidenció que con N=24 jurisdicciones y ausencia de señal lineal, tanto OLS multivariado (LOOCV R² = -0.701) como Ridge (R² = -0.311), modelos univariados (R² = -0.100) y Random Forest (5-Fold R² = -0.802) exhiben desempeño predictivo negativo frente a la media constante, respaldando el uso de atlas geoespaciales descriptivos.</w:t>
       </w:r>
     </w:p>
     <w:p>
@@ -4536,7 +4862,7 @@
           <w:i w:val="0"/>
           <w:sz w:val="20"/>
         </w:rPr>
-        <w:t>Como líneas futuras se proyecta: (i) procesar los microdatos individuales de la ENFR para calibrar modelos multinivel jerárquicos persona-jurisdicción; (ii) incorporar las submuestras bioquímicas de laboratorio de la ENFR (Cuadros 7.9–7.11) para cuantificar formalmente la discrepancia entre diabetes autorreportada y glucemia alterada de laboratorio; y (iii) monitorear la evolución del atlas ante nuevas publicaciones de estadísticas sanitarias y censales.</w:t>
+        <w:t>Como líneas de trabajo futuro que superen directamente las limitaciones ecológicas actuales se proyecta: (i) procesar los microdatos individuales públicos de la ENFR [13] incorporando la edad, el sexo y los factores de expansión a nivel persona mediante modelos multinivel jerárquicos (individuo-provincia) en línea con el enfoque de Marro et al. [16] y estandarización directa por estructura etaria; (ii) integrar las submuestras bioquímicas de glucemia capilar y hemoglobina glicosilada de la ENFR (Cuadros 7.9–7.11) para medir empíricamente la brecha entre diabetes autorreportada y diabetes biológica no diagnosticada; y (iii) estimar modelos econométricos espaciales (Spatial Lag y Spatial Error Models) [19] que incorporen explícitamente la matriz de vecindad geográfica.</w:t>
       </w:r>
     </w:p>
     <w:p>
@@ -4597,7 +4923,7 @@
           <w:i w:val="0"/>
           <w:sz w:val="17"/>
         </w:rPr>
-        <w:t>[3] Instituto Nacional de Estadística y Censos (INDEC) y Secretaría de Gobierno de Salud, "4° Encuesta Nacional de Factores de Riesgo: Resultados definitivos", Buenos Aires: INDEC / Ministerio de Salud, 2019.</w:t>
+        <w:t>[3] K. L. Ong et al. (GBD 2021 Diabetes Collaborators), "Global, regional, and national burden of diabetes from 1990 to 2021, with projections of prevalence to 2050: a systematic analysis for the Global Burden of Disease Study 2021", The Lancet, vol. 402, n.º 10397, pp. 203–234, 2023.</w:t>
       </w:r>
     </w:p>
     <w:p>
@@ -4612,7 +4938,7 @@
           <w:i w:val="0"/>
           <w:sz w:val="17"/>
         </w:rPr>
-        <w:t>[4] M. Marmot, "Social determinants of health inequalities", The Lancet, vol. 365, n.º 9464, pp. 1099–1104, 2005.</w:t>
+        <w:t>[4] F. Hill-Briggs y S. L. Fitzpatrick, "Overview of Social Determinants of Health in the Development of Diabetes", Diabetes Care, vol. 46, n.º 9, pp. 1590–1598, 2023.</w:t>
       </w:r>
     </w:p>
     <w:p>
@@ -4627,7 +4953,7 @@
           <w:i w:val="0"/>
           <w:sz w:val="17"/>
         </w:rPr>
-        <w:t>[5] F. Hill-Briggs et al., "Social Determinants of Health and Diabetes: A Scientific Review", Diabetes Care, vol. 44, n.º 1, pp. 258–279, 2021.</w:t>
+        <w:t>[5] L. E. Egede, J. A. Campbell, R. J. Walker y S. Linde, "Structural Racism as an Upstream Social Determinant of Diabetes Outcomes: A Scoping Review", Diabetes Care, vol. 46, n.º 4, pp. 667–677, 2023.</w:t>
       </w:r>
     </w:p>
     <w:p>
@@ -4642,7 +4968,7 @@
           <w:i w:val="0"/>
           <w:sz w:val="17"/>
         </w:rPr>
-        <w:t>[6] Centers for Disease Control and Prevention (CDC), "Behavioral Risk Factor Surveillance System (BRFSS 2015)", Atlanta: U.S. Department of Health and Human Services, 2016. [En línea]. Disponible: https://www.cdc.gov/brfss</w:t>
+        <w:t>[6] American Diabetes Association Professional Practice Committee, "1. Improving Care and Promoting Health in Populations: Standards of Care in Diabetes—2024", Diabetes Care, vol. 47, Suppl. 1, pp. S11–S19, 2024.</w:t>
       </w:r>
     </w:p>
     <w:p>
@@ -4657,7 +4983,7 @@
           <w:i w:val="0"/>
           <w:sz w:val="17"/>
         </w:rPr>
-        <w:t>[7] Instituto Nacional de Estadística y Censos (INDEC), "Censo Nacional de Población, Hogares y Viviendas 2022: Cobertura de salud", Buenos Aires: INDEC, 2023.</w:t>
+        <w:t>[7] G. A. Benavidez, W. E. Zahnd, P. Hung y J. M. Eberth, "Chronic Disease Prevalence in the US: Sociodemographic and Geographic Variations by Zip Code Tabulation Area", Preventing Chronic Disease, vol. 21, art. 230267, 2024.</w:t>
       </w:r>
     </w:p>
     <w:p>
@@ -4672,7 +4998,7 @@
           <w:i w:val="0"/>
           <w:sz w:val="17"/>
         </w:rPr>
-        <w:t>[8] Instituto Nacional de Estadística y Censos (INDEC), "Incidencia de la pobreza y la indigencia en 31 aglomerados urbanos. Segundo semestre de 2018", Informes Técnicos, vol. 3, n.º 59, Buenos Aires: INDEC, 2019.</w:t>
+        <w:t>[8] J. T. Wittman, D. S. Alexander, M. Bing, R. Montierth, H. Xie, S. R. Benoit y K. McKeever Bullard, "Identifying Priority Geographic Locations for Diabetes Self-Management Education and Support Services in the Appalachian Region", Preventing Chronic Disease, vol. 21, art. 230297, 2024.</w:t>
       </w:r>
     </w:p>
     <w:p>
@@ -4687,7 +5013,7 @@
           <w:i w:val="0"/>
           <w:sz w:val="17"/>
         </w:rPr>
-        <w:t>[9] F. Pedregosa et al., "Scikit-learn: Machine Learning in Python", Journal of Machine Learning Research, vol. 12, pp. 2825–2830, 2011.</w:t>
+        <w:t>[9] A. Gaffney, D. U. Himmelstein y S. Woolhandler, "Prevalence and Correlates of Patient Rationing of Insulin in the United States: A National Survey", Annals of Internal Medicine, vol. 175, n.º 11, pp. 1623–1626, 2022.</w:t>
       </w:r>
     </w:p>
     <w:p>
@@ -4702,7 +5028,7 @@
           <w:i w:val="0"/>
           <w:sz w:val="17"/>
         </w:rPr>
-        <w:t>[10] K. Jordahl et al., "GeoPandas: Python tools for geographic data", 2020. [En línea]. Disponible: https://geopandas.org</w:t>
+        <w:t>[10] M. Fang y E. Selvin, "Cost-Related Insulin Rationing in US Adults Younger Than 65 Years With Diabetes", JAMA, vol. 329, n.º 19, pp. 1700–1702, 2023.</w:t>
       </w:r>
     </w:p>
     <w:p>
@@ -4717,7 +5043,7 @@
           <w:i w:val="0"/>
           <w:sz w:val="17"/>
         </w:rPr>
-        <w:t>[11] G. Dahlgren y M. Whitehead, "Policies and Strategies to Promote Social Equity in Health", Institute for Futures Studies, Estocolmo, 1991.</w:t>
+        <w:t>[11] Centers for Disease Control and Prevention (CDC), "Behavioral Risk Factor Surveillance System (BRFSS) and PLACES: Local Data for Better Health", Atlanta: U.S. Department of Health and Human Services, 2024. [En línea]. Disponible: https://www.cdc.gov/brfss</w:t>
       </w:r>
     </w:p>
     <w:p>
@@ -4732,7 +5058,7 @@
           <w:i w:val="0"/>
           <w:sz w:val="17"/>
         </w:rPr>
-        <w:t>[12] D. J. Gaskin et al., "Disparities in Diabetes: The Nexus of Race, Poverty, and Place", American Journal of Public Health, vol. 104, n.º 11, pp. 2147–2155, 2014.</w:t>
+        <w:t>[12] Instituto Nacional de Estadística y Censos (INDEC), "Censo Nacional de Población, Hogares y Viviendas 2022: Resultados definitivos de cobertura de salud y condiciones habitacionales", Buenos Aires: INDEC, 2023.</w:t>
       </w:r>
     </w:p>
     <w:p>
@@ -4747,7 +5073,7 @@
           <w:i w:val="0"/>
           <w:sz w:val="17"/>
         </w:rPr>
-        <w:t>[13] L. Dwyer-Lindgren et al., "Diagnosed and Undiagnosed Diabetes Prevalence by County in the U.S., 1999–2012", Diabetes Care, vol. 39, n.º 9, pp. 1556–1562, 2016.</w:t>
+        <w:t>[13] Instituto Nacional de Estadística y Censos (INDEC), "Bases de microdatos y cuadros estadísticos de la Encuesta Nacional de Factores de Riesgo (ENFR) y Encuesta Permanente de Hogares (EPH)", Buenos Aires: INDEC, 2023. [En línea]. Disponible: https://www.indec.gob.ar</w:t>
       </w:r>
     </w:p>
     <w:p>
@@ -4762,7 +5088,7 @@
           <w:i w:val="0"/>
           <w:sz w:val="17"/>
         </w:rPr>
-        <w:t>[14] G. James, D. Witten, T. Hastie y R. Tibshirani, "An Introduction to Statistical Learning: with Applications in Python", Springer, 2023.</w:t>
+        <w:t>[14] Ministerio de Salud de la Nación Argentina, "Guía de Práctica Clínica Nacional sobre Prevención, Diagnóstico y Tratamiento de la Diabetes Mellitus Tipo 2 (DM2) — Resolución Ministerial N.º 3877/2023", Buenos Aires: Dirección Nacional de Abordaje Integral de Enfermedades No Transmisibles, 2023.</w:t>
       </w:r>
     </w:p>
     <w:p>
@@ -4777,7 +5103,7 @@
           <w:i w:val="0"/>
           <w:sz w:val="17"/>
         </w:rPr>
-        <w:t>[15] C. M. Leveau, M. J. Marro, V. Alonso y A. E. B. Lawrynowicz, "¿El contexto geográfico importa en la mortalidad por diabetes mellitus? Tendencias espacio-temporales en Argentina, 1990–2012", Cadernos de Saúde Pública, vol. 33, n.º 1, e00169615, 2017.</w:t>
+        <w:t>[15] Ministerio de Salud de la Nación Argentina, "Programa Nacional Remediar y PRODIABA (Ley N.º 26.914): Provisión gratuita de medicamentos esenciales e insumos en el Primer Nivel de Atención", Buenos Aires: Ministerio de Salud de la Nación, 2023.</w:t>
       </w:r>
     </w:p>
     <w:p>
@@ -4792,7 +5118,7 @@
           <w:i w:val="0"/>
           <w:sz w:val="17"/>
         </w:rPr>
-        <w:t>[16] M. J. Marro, A. M. Cardoso e I. da Costa Leite, "Desigualdades regionales en la mortalidad por diabetes mellitus y en el acceso a la salud en Argentina", Cadernos de Saúde Pública, vol. 33, n.º 9, e00113016, 2017.</w:t>
+        <w:t>[16] M. J. Marro, M. de J. Mendes da Fonseca, I. da Costa Leite, C. Ballejo y M. Alazraqui, "Un retorno al ambiente en epidemiología: análisis multinivel de la diabetes mellitus en un gran aglomerado urbano de Argentina", Revista Brasileira de Epidemiologia, vol. 29, e260043, 2026.</w:t>
       </w:r>
     </w:p>
     <w:p>
@@ -4807,7 +5133,7 @@
           <w:i w:val="0"/>
           <w:sz w:val="17"/>
         </w:rPr>
-        <w:t>[17] M. J. Marro, M. de J. Mendes da Fonseca, I. da Costa Leite, C. Ballejo y M. Alazraqui, "Un retorno al ambiente en epidemiología: análisis multinivel de la diabetes mellitus en un gran aglomerado urbano de Argentina", Revista Brasileira de Epidemiologia, vol. 29, e260043, 2026.</w:t>
+        <w:t>[17] J. F. Elgart, E. Rucci y J. J. Gagliardino, "Visión epidemiológica, psicosocial y terapéutica de la diabetes mellitus en Argentina desde las perspectivas del equipo de salud y de las personas con diabetes", Revista de la Sociedad Argentina de Diabetes, vol. 56, n.º 1, pp. 31–37, 2022.</w:t>
       </w:r>
     </w:p>
     <w:p>
@@ -4822,7 +5148,7 @@
           <w:i w:val="0"/>
           <w:sz w:val="17"/>
         </w:rPr>
-        <w:t>[18] P. Santana, C. Costa, A. Loureiro, J. Raposo et al., "Geografias da Diabetes Mellitus em Portugal: Como as Condições do Contexto Influenciam o Risco de Morrer", Acta Médica Portuguesa, vol. 27, n.º 3, pp. 309–317, 2014.</w:t>
+        <w:t>[18] T. Ortiz-Basso, B. R. Boietti, P. V. Gómez, A. D. Boffelli y A. A. Paladini, "Prevalencia de retinopatía diabética en una zona rural de Argentina", Medicina (Buenos Aires), vol. 82, n.º 1, pp. 99–103, 2022.</w:t>
       </w:r>
     </w:p>
     <w:p>
@@ -4837,7 +5163,7 @@
           <w:i w:val="0"/>
           <w:sz w:val="17"/>
         </w:rPr>
-        <w:t>[19] C. S. De La Cruz Castañeda, "Modelamiento predictivo y distribución geoespacial de niveles de gasto en pacientes con diabetes del SIS, Perú", tesis de grado, Univ. Nac. Toribio Rodríguez de Mendoza, 2026.</w:t>
+        <w:t>[19] S. J. Rey, D. Arribas-Bel y L. J. Wolf, "Geographic Data Science with Python", Boca Raton: CRC Press / Chapman &amp; Hall, 2023.</w:t>
       </w:r>
     </w:p>
     <w:p>
@@ -4852,7 +5178,7 @@
           <w:i w:val="0"/>
           <w:sz w:val="17"/>
         </w:rPr>
-        <w:t>[20] T. Ortiz-Basso, B. R. Boietti, P. V. Gómez, A. D. Boffelli y A. A. Paladini, "Prevalencia de retinopatía diabética en una zona rural de Argentina", Medicina (Buenos Aires), vol. 82, n.º 1, pp. 99–103, 2022.</w:t>
+        <w:t>[20] G. James, D. Witten, T. Hastie, R. Tibshirani y J. Taylor, "An Introduction to Statistical Learning: with Applications in Python", Cham: Springer, 2023.</w:t>
       </w:r>
     </w:p>
     <w:p>
@@ -4867,7 +5193,7 @@
           <w:i w:val="0"/>
           <w:sz w:val="17"/>
         </w:rPr>
-        <w:t>[21] J. P. Mackenbach et al., "Socioeconomic Inequalities in Health in 22 European Countries", New England Journal of Medicine, vol. 358, pp. 2468–2481, 2008.</w:t>
+        <w:t>[21] G. Varoquaux y V. Cheplygina, "Machine learning for medical imaging: methodological failures and recommendations for the future", npj Digital Medicine, vol. 5, n.º 1, art. 48, 2022.</w:t>
       </w:r>
     </w:p>
     <w:p>
@@ -4882,7 +5208,7 @@
           <w:i w:val="0"/>
           <w:sz w:val="17"/>
         </w:rPr>
-        <w:t>[22] S. Openshaw, "The Modifiable Areal Unit Problem", Concepts and Techniques in Modern Geography, vol. 38, Geo Books, Norwich, 1984.</w:t>
+        <w:t>[22] G. S. Collins, K. G. M. Moons, P. Dhiman et al., "TRIPOD+AI statement: updated guidance for reporting clinical prediction models that use regression or machine learning methods", BMJ, vol. 385, e078378, 2024.</w:t>
       </w:r>
     </w:p>
     <w:p>
@@ -4897,7 +5223,7 @@
           <w:i w:val="0"/>
           <w:sz w:val="17"/>
         </w:rPr>
-        <w:t>[23] J. G. MacKinnon y H. White, "Some Heteroskedasticity-Consistent Covariance Matrix Estimators with Improved Finite Sample Properties", Journal of Econometrics, vol. 29, pp. 305–325, 1985.</w:t>
+        <w:t>[23] K. Jordahl et al., "GeoPandas: Python tools for geographic data (v1.0)", Zenodo, 2024. [En línea]. Disponible: https://geopandas.org</w:t>
       </w:r>
     </w:p>
     <w:p>
@@ -4912,7 +5238,7 @@
           <w:i w:val="0"/>
           <w:sz w:val="17"/>
         </w:rPr>
-        <w:t>[24] L. Breiman, "Random Forests", Machine Learning, vol. 45, n.º 1, pp. 5–32, 2001.</w:t>
+        <w:t>[24] Scikit-learn Developers, "Scikit-learn: Machine Learning in Python (v1.5 Documentation)", 2024. [En línea]. Disponible: https://scikit-learn.org</w:t>
       </w:r>
     </w:p>
     <w:p>
@@ -4927,37 +5253,7 @@
           <w:i w:val="0"/>
           <w:sz w:val="17"/>
         </w:rPr>
-        <w:t>[25] World Health Organization (WHO), "Global Report on Diabetes", Ginebra: OMS, 2016.</w:t>
-      </w:r>
-    </w:p>
-    <w:p>
-      <w:pPr>
-        <w:spacing w:after="40" w:line="240" w:lineRule="auto"/>
-        <w:jc w:val="both"/>
-      </w:pPr>
-      <w:r>
-        <w:rPr>
-          <w:rFonts w:ascii="Times New Roman" w:hAnsi="Times New Roman" w:eastAsia="Times New Roman"/>
-          <w:b w:val="0"/>
-          <w:i w:val="0"/>
-          <w:sz w:val="17"/>
-        </w:rPr>
-        <w:t>[26] American Diabetes Association, "Insulin Access and Affordability Working Group: Conclusions and Recommendations", Diabetes Care, vol. 41, n.º 6, pp. 1299–1311, 2018.</w:t>
-      </w:r>
-    </w:p>
-    <w:p>
-      <w:pPr>
-        <w:spacing w:after="40" w:line="240" w:lineRule="auto"/>
-        <w:jc w:val="both"/>
-      </w:pPr>
-      <w:r>
-        <w:rPr>
-          <w:rFonts w:ascii="Times New Roman" w:hAnsi="Times New Roman" w:eastAsia="Times New Roman"/>
-          <w:b w:val="0"/>
-          <w:i w:val="0"/>
-          <w:sz w:val="17"/>
-        </w:rPr>
-        <w:t>[27] Ministerio de Salud de la Nación, "Programa Nacional de Medicamentos Esenciales Remediar: Evaluación de cobertura y equidad distributiva", Buenos Aires: Ministerio de Salud, 2020.</w:t>
+        <w:t>[25] World Health Organization (WHO), "Global Diabetes Compact and Noncommunicable Diseases Progress Monitor", Ginebra: Organización Mundial de la Salud, 2022.</w:t>
       </w:r>
     </w:p>
     <w:sectPr>

</xml_diff>